<commit_message>
mise a jour - guide
</commit_message>
<xml_diff>
--- a/GUIDE_UTILISATEUR_interactive_mission_qc_console_FR.docx
+++ b/GUIDE_UTILISATEUR_interactive_mission_qc_console_FR.docx
@@ -2,7 +2,7 @@
 <file path=word/document.xml><?xml version="1.0" encoding="utf-8"?>
 <w:document xmlns:w="http://schemas.openxmlformats.org/wordprocessingml/2006/main" xmlns:m="http://schemas.openxmlformats.org/officeDocument/2006/math" xmlns:r="http://schemas.openxmlformats.org/officeDocument/2006/relationships" xmlns:o="urn:schemas-microsoft-com:office:office" xmlns:v="urn:schemas-microsoft-com:vml" xmlns:w10="urn:schemas-microsoft-com:office:word" xmlns:a="http://schemas.openxmlformats.org/drawingml/2006/main" xmlns:pic="http://schemas.openxmlformats.org/drawingml/2006/picture" xmlns:wp="http://schemas.openxmlformats.org/drawingml/2006/wordprocessingDrawing">
   <w:body>
-    <w:bookmarkStart w:id="48" w:name="guide-utilisateur-complet-fr"/>
+    <w:bookmarkStart w:id="54" w:name="guide-utilisateur-complet-fr"/>
     <w:p>
       <w:pPr>
         <w:pStyle w:val="Heading1"/>
@@ -112,7 +112,7 @@
         <w:t xml:space="preserve"> </w:t>
       </w:r>
       <w:r>
-        <w:t xml:space="preserve">utilisation interactive du script, génération de corrections, validation croisée, production d’un script de fixes exécutable</w:t>
+        <w:t xml:space="preserve">utilisation interactive du script, génération de corrections, validation croisée (R1–R11), production d’un script de fixes exécutable et synthèse globale des erreurs mission</w:t>
       </w:r>
     </w:p>
     <w:p>
@@ -291,7 +291,7 @@
         <w:t xml:space="preserve"> </w:t>
       </w:r>
       <w:r>
-        <w:t xml:space="preserve">(R1 à R9) sur</w:t>
+        <w:t xml:space="preserve">(R1 à R11) sur</w:t>
       </w:r>
       <w:r>
         <w:t xml:space="preserve"> </w:t>
@@ -301,6 +301,21 @@
           <w:rStyle w:val="VerbatimChar"/>
         </w:rPr>
         <w:t xml:space="preserve">observations</w:t>
+      </w:r>
+      <w:r>
+        <w:t xml:space="preserve"> </w:t>
+      </w:r>
+      <w:r>
+        <w:t xml:space="preserve">et</w:t>
+      </w:r>
+      <w:r>
+        <w:t xml:space="preserve"> </w:t>
+      </w:r>
+      <w:r>
+        <w:rPr>
+          <w:rStyle w:val="VerbatimChar"/>
+        </w:rPr>
+        <w:t xml:space="preserve">transects</w:t>
       </w:r>
       <w:r>
         <w:t xml:space="preserve">.</w:t>
@@ -536,7 +551,27 @@
         <w:br/>
       </w:r>
       <w:r>
-        <w:t xml:space="preserve">Règles CV R1–R9 + boucle interactive de traitement CV.</w:t>
+        <w:t xml:space="preserve">Règles CV R1–R11 + boucle interactive de traitement CV.</w:t>
+      </w:r>
+    </w:p>
+    <w:p>
+      <w:pPr>
+        <w:numPr>
+          <w:ilvl w:val="0"/>
+          <w:numId w:val="1004"/>
+        </w:numPr>
+      </w:pPr>
+      <w:r>
+        <w:rPr>
+          <w:rStyle w:val="VerbatimChar"/>
+        </w:rPr>
+        <w:t xml:space="preserve">mission_error_inventory.R</w:t>
+      </w:r>
+      <w:r>
+        <w:br/>
+      </w:r>
+      <w:r>
+        <w:t xml:space="preserve">Agrège les erreurs (profiler + CV), calcule un signal d’import suspect et exporte un sommaire Excel mission.</w:t>
       </w:r>
     </w:p>
     <w:bookmarkEnd w:id="12"/>
@@ -637,7 +672,7 @@
         <w:br/>
       </w:r>
       <w:r>
-        <w:t xml:space="preserve">Détail des règles R1–R9.</w:t>
+        <w:t xml:space="preserve">Détail des règles R1–R11.</w:t>
       </w:r>
     </w:p>
     <w:bookmarkEnd w:id="14"/>
@@ -972,6 +1007,138 @@
       </w:r>
       <w:r>
         <w:t xml:space="preserve">(index global des rapports mission).</w:t>
+      </w:r>
+    </w:p>
+    <w:p>
+      <w:pPr>
+        <w:pStyle w:val="Compact"/>
+        <w:numPr>
+          <w:ilvl w:val="0"/>
+          <w:numId w:val="1008"/>
+        </w:numPr>
+      </w:pPr>
+      <w:r>
+        <w:rPr>
+          <w:rStyle w:val="VerbatimChar"/>
+        </w:rPr>
+        <w:t xml:space="preserve">mission_error_inventory.R</w:t>
+      </w:r>
+    </w:p>
+    <w:p>
+      <w:pPr>
+        <w:pStyle w:val="Compact"/>
+        <w:numPr>
+          <w:ilvl w:val="1"/>
+          <w:numId w:val="1012"/>
+        </w:numPr>
+      </w:pPr>
+      <w:r>
+        <w:rPr>
+          <w:b/>
+          <w:bCs/>
+        </w:rPr>
+        <w:t xml:space="preserve">Sortie Excel synthèse</w:t>
+      </w:r>
+      <w:r>
+        <w:t xml:space="preserve"> </w:t>
+      </w:r>
+      <w:r>
+        <w:t xml:space="preserve">:</w:t>
+      </w:r>
+      <w:r>
+        <w:t xml:space="preserve"> </w:t>
+      </w:r>
+      <w:r>
+        <w:rPr>
+          <w:rStyle w:val="VerbatimChar"/>
+        </w:rPr>
+        <w:t xml:space="preserve">MissionReports/mission_error_summary_&lt;ACCDB_TAG&gt;.xlsx</w:t>
+      </w:r>
+    </w:p>
+    <w:p>
+      <w:pPr>
+        <w:pStyle w:val="Compact"/>
+        <w:numPr>
+          <w:ilvl w:val="1"/>
+          <w:numId w:val="1012"/>
+        </w:numPr>
+      </w:pPr>
+      <w:r>
+        <w:rPr>
+          <w:b/>
+          <w:bCs/>
+        </w:rPr>
+        <w:t xml:space="preserve">Onglets</w:t>
+      </w:r>
+      <w:r>
+        <w:t xml:space="preserve"> </w:t>
+      </w:r>
+      <w:r>
+        <w:t xml:space="preserve">:</w:t>
+      </w:r>
+      <w:r>
+        <w:t xml:space="preserve"> </w:t>
+      </w:r>
+      <w:r>
+        <w:rPr>
+          <w:rStyle w:val="VerbatimChar"/>
+        </w:rPr>
+        <w:t xml:space="preserve">Summary</w:t>
+      </w:r>
+      <w:r>
+        <w:t xml:space="preserve">,</w:t>
+      </w:r>
+      <w:r>
+        <w:t xml:space="preserve"> </w:t>
+      </w:r>
+      <w:r>
+        <w:rPr>
+          <w:rStyle w:val="VerbatimChar"/>
+        </w:rPr>
+        <w:t xml:space="preserve">Long</w:t>
+      </w:r>
+      <w:r>
+        <w:t xml:space="preserve">,</w:t>
+      </w:r>
+      <w:r>
+        <w:t xml:space="preserve"> </w:t>
+      </w:r>
+      <w:r>
+        <w:rPr>
+          <w:rStyle w:val="VerbatimChar"/>
+        </w:rPr>
+        <w:t xml:space="preserve">ImportSuspected</w:t>
+      </w:r>
+    </w:p>
+    <w:p>
+      <w:pPr>
+        <w:pStyle w:val="Compact"/>
+        <w:numPr>
+          <w:ilvl w:val="1"/>
+          <w:numId w:val="1012"/>
+        </w:numPr>
+      </w:pPr>
+      <w:r>
+        <w:rPr>
+          <w:b/>
+          <w:bCs/>
+        </w:rPr>
+        <w:t xml:space="preserve">Usage</w:t>
+      </w:r>
+      <w:r>
+        <w:t xml:space="preserve"> </w:t>
+      </w:r>
+      <w:r>
+        <w:t xml:space="preserve">: repérer rapidement les missions avec volume d’erreurs anormal (</w:t>
+      </w:r>
+      <w:r>
+        <w:rPr>
+          <w:rStyle w:val="VerbatimChar"/>
+        </w:rPr>
+        <w:t xml:space="preserve">import_issue_suspected</w:t>
+      </w:r>
+      <w:r>
+        <w:t xml:space="preserve">) en parallèle de la console interactive.</w:t>
       </w:r>
     </w:p>
     <w:p>
@@ -1030,7 +1197,7 @@
         <w:pStyle w:val="Compact"/>
         <w:numPr>
           <w:ilvl w:val="0"/>
-          <w:numId w:val="1012"/>
+          <w:numId w:val="1013"/>
         </w:numPr>
       </w:pPr>
       <w:r>
@@ -1064,7 +1231,7 @@
         <w:pStyle w:val="Compact"/>
         <w:numPr>
           <w:ilvl w:val="0"/>
-          <w:numId w:val="1012"/>
+          <w:numId w:val="1013"/>
         </w:numPr>
       </w:pPr>
       <w:r>
@@ -1076,7 +1243,7 @@
         <w:pStyle w:val="Compact"/>
         <w:numPr>
           <w:ilvl w:val="0"/>
-          <w:numId w:val="1012"/>
+          <w:numId w:val="1013"/>
         </w:numPr>
       </w:pPr>
       <w:r>
@@ -1125,7 +1292,7 @@
         <w:pStyle w:val="Compact"/>
         <w:numPr>
           <w:ilvl w:val="0"/>
-          <w:numId w:val="1013"/>
+          <w:numId w:val="1014"/>
         </w:numPr>
       </w:pPr>
       <w:r>
@@ -1140,7 +1307,7 @@
         <w:pStyle w:val="Compact"/>
         <w:numPr>
           <w:ilvl w:val="0"/>
-          <w:numId w:val="1013"/>
+          <w:numId w:val="1014"/>
         </w:numPr>
       </w:pPr>
       <w:r>
@@ -1155,7 +1322,7 @@
         <w:pStyle w:val="Compact"/>
         <w:numPr>
           <w:ilvl w:val="0"/>
-          <w:numId w:val="1013"/>
+          <w:numId w:val="1014"/>
         </w:numPr>
       </w:pPr>
       <w:r>
@@ -1170,7 +1337,7 @@
         <w:pStyle w:val="Compact"/>
         <w:numPr>
           <w:ilvl w:val="0"/>
-          <w:numId w:val="1013"/>
+          <w:numId w:val="1014"/>
         </w:numPr>
       </w:pPr>
       <w:r>
@@ -1185,7 +1352,7 @@
         <w:pStyle w:val="Compact"/>
         <w:numPr>
           <w:ilvl w:val="0"/>
-          <w:numId w:val="1013"/>
+          <w:numId w:val="1014"/>
         </w:numPr>
       </w:pPr>
       <w:r>
@@ -1200,7 +1367,7 @@
         <w:pStyle w:val="Compact"/>
         <w:numPr>
           <w:ilvl w:val="0"/>
-          <w:numId w:val="1013"/>
+          <w:numId w:val="1014"/>
         </w:numPr>
       </w:pPr>
       <w:r>
@@ -1233,7 +1400,7 @@
         <w:pStyle w:val="Compact"/>
         <w:numPr>
           <w:ilvl w:val="0"/>
-          <w:numId w:val="1014"/>
+          <w:numId w:val="1015"/>
         </w:numPr>
       </w:pPr>
       <w:r>
@@ -1248,7 +1415,7 @@
         <w:pStyle w:val="Compact"/>
         <w:numPr>
           <w:ilvl w:val="0"/>
-          <w:numId w:val="1014"/>
+          <w:numId w:val="1015"/>
         </w:numPr>
       </w:pPr>
       <w:r>
@@ -1263,7 +1430,7 @@
         <w:pStyle w:val="Compact"/>
         <w:numPr>
           <w:ilvl w:val="0"/>
-          <w:numId w:val="1014"/>
+          <w:numId w:val="1015"/>
         </w:numPr>
       </w:pPr>
       <w:r>
@@ -1278,7 +1445,7 @@
         <w:pStyle w:val="Compact"/>
         <w:numPr>
           <w:ilvl w:val="0"/>
-          <w:numId w:val="1014"/>
+          <w:numId w:val="1015"/>
         </w:numPr>
       </w:pPr>
       <w:r>
@@ -1370,7 +1537,7 @@
         <w:pStyle w:val="Compact"/>
         <w:numPr>
           <w:ilvl w:val="0"/>
-          <w:numId w:val="1015"/>
+          <w:numId w:val="1016"/>
         </w:numPr>
       </w:pPr>
       <w:r>
@@ -1420,7 +1587,7 @@
         <w:pStyle w:val="Compact"/>
         <w:numPr>
           <w:ilvl w:val="0"/>
-          <w:numId w:val="1016"/>
+          <w:numId w:val="1017"/>
         </w:numPr>
       </w:pPr>
       <w:r>
@@ -1432,7 +1599,7 @@
         <w:pStyle w:val="Compact"/>
         <w:numPr>
           <w:ilvl w:val="0"/>
-          <w:numId w:val="1016"/>
+          <w:numId w:val="1017"/>
         </w:numPr>
       </w:pPr>
       <w:r>
@@ -1521,7 +1688,7 @@
         <w:pStyle w:val="Compact"/>
         <w:numPr>
           <w:ilvl w:val="0"/>
-          <w:numId w:val="1017"/>
+          <w:numId w:val="1018"/>
         </w:numPr>
       </w:pPr>
       <w:r>
@@ -1557,7 +1724,7 @@
         <w:pStyle w:val="Compact"/>
         <w:numPr>
           <w:ilvl w:val="0"/>
-          <w:numId w:val="1017"/>
+          <w:numId w:val="1018"/>
         </w:numPr>
       </w:pPr>
       <w:r>
@@ -1569,7 +1736,7 @@
         <w:pStyle w:val="Compact"/>
         <w:numPr>
           <w:ilvl w:val="0"/>
-          <w:numId w:val="1017"/>
+          <w:numId w:val="1018"/>
         </w:numPr>
       </w:pPr>
       <w:r>
@@ -1581,7 +1748,7 @@
         <w:pStyle w:val="Compact"/>
         <w:numPr>
           <w:ilvl w:val="0"/>
-          <w:numId w:val="1017"/>
+          <w:numId w:val="1018"/>
         </w:numPr>
       </w:pPr>
       <w:r>
@@ -1593,7 +1760,7 @@
         <w:pStyle w:val="Compact"/>
         <w:numPr>
           <w:ilvl w:val="0"/>
-          <w:numId w:val="1017"/>
+          <w:numId w:val="1018"/>
         </w:numPr>
       </w:pPr>
       <w:r>
@@ -1617,11 +1784,202 @@
         <w:pStyle w:val="Compact"/>
         <w:numPr>
           <w:ilvl w:val="0"/>
-          <w:numId w:val="1017"/>
+          <w:numId w:val="1018"/>
         </w:numPr>
       </w:pPr>
       <w:r>
         <w:t xml:space="preserve">démarre la boucle interactive QA.</w:t>
+      </w:r>
+    </w:p>
+    <w:bookmarkEnd w:id="23"/>
+    <w:bookmarkStart w:id="24" w:name="Xda04a961599fbc24fd9b0e14bf2952a3f13301f"/>
+    <w:p>
+      <w:pPr>
+        <w:pStyle w:val="Heading2"/>
+      </w:pPr>
+      <w:r>
+        <w:t xml:space="preserve">4.1 Auto-détection des dossiers et de la base (court)</w:t>
+      </w:r>
+    </w:p>
+    <w:p>
+      <w:pPr>
+        <w:pStyle w:val="FirstParagraph"/>
+      </w:pPr>
+      <w:r>
+        <w:t xml:space="preserve">Le script détecte automatiquement :</w:t>
+      </w:r>
+    </w:p>
+    <w:p>
+      <w:pPr>
+        <w:pStyle w:val="Compact"/>
+        <w:numPr>
+          <w:ilvl w:val="0"/>
+          <w:numId w:val="1019"/>
+        </w:numPr>
+      </w:pPr>
+      <w:r>
+        <w:t xml:space="preserve">la racine repo (</w:t>
+      </w:r>
+      <w:r>
+        <w:rPr>
+          <w:rStyle w:val="VerbatimChar"/>
+        </w:rPr>
+        <w:t xml:space="preserve">.repo_root</w:t>
+      </w:r>
+      <w:r>
+        <w:t xml:space="preserve">) depuis le script/fichier actif, sinon</w:t>
+      </w:r>
+      <w:r>
+        <w:t xml:space="preserve"> </w:t>
+      </w:r>
+      <w:r>
+        <w:rPr>
+          <w:rStyle w:val="VerbatimChar"/>
+        </w:rPr>
+        <w:t xml:space="preserve">getwd()</w:t>
+      </w:r>
+      <w:r>
+        <w:t xml:space="preserve">,</w:t>
+      </w:r>
+    </w:p>
+    <w:p>
+      <w:pPr>
+        <w:pStyle w:val="Compact"/>
+        <w:numPr>
+          <w:ilvl w:val="0"/>
+          <w:numId w:val="1019"/>
+        </w:numPr>
+      </w:pPr>
+      <w:r>
+        <w:t xml:space="preserve">le dossier Access (</w:t>
+      </w:r>
+      <w:r>
+        <w:rPr>
+          <w:rStyle w:val="VerbatimChar"/>
+        </w:rPr>
+        <w:t xml:space="preserve">db_dir</w:t>
+      </w:r>
+      <w:r>
+        <w:t xml:space="preserve">) 2 niveaux au-dessus de</w:t>
+      </w:r>
+      <w:r>
+        <w:t xml:space="preserve"> </w:t>
+      </w:r>
+      <w:r>
+        <w:rPr>
+          <w:rStyle w:val="VerbatimChar"/>
+        </w:rPr>
+        <w:t xml:space="preserve">SOMEC_Editeur</w:t>
+      </w:r>
+      <w:r>
+        <w:t xml:space="preserve">,</w:t>
+      </w:r>
+    </w:p>
+    <w:p>
+      <w:pPr>
+        <w:pStyle w:val="Compact"/>
+        <w:numPr>
+          <w:ilvl w:val="0"/>
+          <w:numId w:val="1019"/>
+        </w:numPr>
+      </w:pPr>
+      <w:r>
+        <w:t xml:space="preserve">la base ACCDB avec cette priorité :</w:t>
+      </w:r>
+    </w:p>
+    <w:p>
+      <w:pPr>
+        <w:pStyle w:val="Compact"/>
+        <w:numPr>
+          <w:ilvl w:val="1"/>
+          <w:numId w:val="1020"/>
+        </w:numPr>
+      </w:pPr>
+      <w:r>
+        <w:rPr>
+          <w:rStyle w:val="VerbatimChar"/>
+        </w:rPr>
+        <w:t xml:space="preserve">SOMEC_ACCDB_PATH</w:t>
+      </w:r>
+      <w:r>
+        <w:t xml:space="preserve">,</w:t>
+      </w:r>
+    </w:p>
+    <w:p>
+      <w:pPr>
+        <w:pStyle w:val="Compact"/>
+        <w:numPr>
+          <w:ilvl w:val="1"/>
+          <w:numId w:val="1020"/>
+        </w:numPr>
+      </w:pPr>
+      <w:r>
+        <w:rPr>
+          <w:rStyle w:val="VerbatimChar"/>
+        </w:rPr>
+        <w:t xml:space="preserve">SOMEC_ACCDB_SUFFIX</w:t>
+      </w:r>
+      <w:r>
+        <w:t xml:space="preserve">,</w:t>
+      </w:r>
+    </w:p>
+    <w:p>
+      <w:pPr>
+        <w:pStyle w:val="Compact"/>
+        <w:numPr>
+          <w:ilvl w:val="1"/>
+          <w:numId w:val="1020"/>
+        </w:numPr>
+      </w:pPr>
+      <w:r>
+        <w:t xml:space="preserve">dernier fichier</w:t>
+      </w:r>
+      <w:r>
+        <w:t xml:space="preserve"> </w:t>
+      </w:r>
+      <w:r>
+        <w:rPr>
+          <w:rStyle w:val="VerbatimChar"/>
+        </w:rPr>
+        <w:t xml:space="preserve">SOMEC_YYYYMMDD.accdb</w:t>
+      </w:r>
+      <w:r>
+        <w:t xml:space="preserve"> </w:t>
+      </w:r>
+      <w:r>
+        <w:t xml:space="preserve">modifié,</w:t>
+      </w:r>
+    </w:p>
+    <w:p>
+      <w:pPr>
+        <w:pStyle w:val="Compact"/>
+        <w:numPr>
+          <w:ilvl w:val="1"/>
+          <w:numId w:val="1020"/>
+        </w:numPr>
+      </w:pPr>
+      <w:r>
+        <w:t xml:space="preserve">saisie interactive.</w:t>
+      </w:r>
+    </w:p>
+    <w:p>
+      <w:pPr>
+        <w:pStyle w:val="FirstParagraph"/>
+      </w:pPr>
+      <w:r>
+        <w:t xml:space="preserve">En cas de doute, forcer explicitement</w:t>
+      </w:r>
+      <w:r>
+        <w:t xml:space="preserve"> </w:t>
+      </w:r>
+      <w:r>
+        <w:rPr>
+          <w:rStyle w:val="VerbatimChar"/>
+        </w:rPr>
+        <w:t xml:space="preserve">SOMEC_ACCDB_PATH</w:t>
+      </w:r>
+      <w:r>
+        <w:t xml:space="preserve">.</w:t>
       </w:r>
     </w:p>
     <w:p>
@@ -1631,8 +1989,8 @@
         </w:pict>
       </w:r>
     </w:p>
-    <w:bookmarkEnd w:id="23"/>
-    <w:bookmarkStart w:id="24" w:name="sélection-des-missions"/>
+    <w:bookmarkEnd w:id="24"/>
+    <w:bookmarkStart w:id="25" w:name="sélection-des-missions"/>
     <w:p>
       <w:pPr>
         <w:pStyle w:val="Heading2"/>
@@ -1654,7 +2012,7 @@
         <w:pStyle w:val="Compact"/>
         <w:numPr>
           <w:ilvl w:val="0"/>
-          <w:numId w:val="1018"/>
+          <w:numId w:val="1021"/>
         </w:numPr>
       </w:pPr>
       <w:r>
@@ -1675,7 +2033,7 @@
         <w:pStyle w:val="Compact"/>
         <w:numPr>
           <w:ilvl w:val="0"/>
-          <w:numId w:val="1018"/>
+          <w:numId w:val="1021"/>
         </w:numPr>
       </w:pPr>
       <w:r>
@@ -1696,7 +2054,7 @@
         <w:pStyle w:val="Compact"/>
         <w:numPr>
           <w:ilvl w:val="0"/>
-          <w:numId w:val="1018"/>
+          <w:numId w:val="1021"/>
         </w:numPr>
       </w:pPr>
       <w:r>
@@ -1727,8 +2085,8 @@
         </w:pict>
       </w:r>
     </w:p>
-    <w:bookmarkEnd w:id="24"/>
-    <w:bookmarkStart w:id="25" w:name="types-danomalies-traités"/>
+    <w:bookmarkEnd w:id="25"/>
+    <w:bookmarkStart w:id="26" w:name="types-danomalies-traités"/>
     <w:p>
       <w:pPr>
         <w:pStyle w:val="Heading2"/>
@@ -1750,7 +2108,7 @@
         <w:pStyle w:val="Compact"/>
         <w:numPr>
           <w:ilvl w:val="0"/>
-          <w:numId w:val="1019"/>
+          <w:numId w:val="1022"/>
         </w:numPr>
       </w:pPr>
       <w:r>
@@ -1771,7 +2129,7 @@
         <w:pStyle w:val="Compact"/>
         <w:numPr>
           <w:ilvl w:val="0"/>
-          <w:numId w:val="1019"/>
+          <w:numId w:val="1022"/>
         </w:numPr>
       </w:pPr>
       <w:r>
@@ -1792,7 +2150,7 @@
         <w:pStyle w:val="Compact"/>
         <w:numPr>
           <w:ilvl w:val="0"/>
-          <w:numId w:val="1019"/>
+          <w:numId w:val="1022"/>
         </w:numPr>
       </w:pPr>
       <w:r>
@@ -1821,7 +2179,7 @@
         <w:pStyle w:val="Compact"/>
         <w:numPr>
           <w:ilvl w:val="0"/>
-          <w:numId w:val="1020"/>
+          <w:numId w:val="1023"/>
         </w:numPr>
       </w:pPr>
       <w:r>
@@ -1833,7 +2191,7 @@
         <w:pStyle w:val="Compact"/>
         <w:numPr>
           <w:ilvl w:val="0"/>
-          <w:numId w:val="1020"/>
+          <w:numId w:val="1023"/>
         </w:numPr>
       </w:pPr>
       <w:r>
@@ -1845,7 +2203,7 @@
         <w:pStyle w:val="Compact"/>
         <w:numPr>
           <w:ilvl w:val="0"/>
-          <w:numId w:val="1020"/>
+          <w:numId w:val="1023"/>
         </w:numPr>
       </w:pPr>
       <w:r>
@@ -1866,7 +2224,7 @@
         <w:pStyle w:val="Compact"/>
         <w:numPr>
           <w:ilvl w:val="0"/>
-          <w:numId w:val="1020"/>
+          <w:numId w:val="1023"/>
         </w:numPr>
       </w:pPr>
       <w:r>
@@ -1878,7 +2236,7 @@
         <w:pStyle w:val="Compact"/>
         <w:numPr>
           <w:ilvl w:val="0"/>
-          <w:numId w:val="1020"/>
+          <w:numId w:val="1023"/>
         </w:numPr>
       </w:pPr>
       <w:r>
@@ -1892,8 +2250,8 @@
         </w:pict>
       </w:r>
     </w:p>
-    <w:bookmarkEnd w:id="25"/>
-    <w:bookmarkStart w:id="26" w:name="navigation-interactive-par-anomalie"/>
+    <w:bookmarkEnd w:id="26"/>
+    <w:bookmarkStart w:id="27" w:name="navigation-interactive-par-anomalie"/>
     <w:p>
       <w:pPr>
         <w:pStyle w:val="Heading2"/>
@@ -1915,7 +2273,7 @@
         <w:pStyle w:val="Compact"/>
         <w:numPr>
           <w:ilvl w:val="0"/>
-          <w:numId w:val="1021"/>
+          <w:numId w:val="1024"/>
         </w:numPr>
       </w:pPr>
       <w:r>
@@ -1936,7 +2294,7 @@
         <w:pStyle w:val="Compact"/>
         <w:numPr>
           <w:ilvl w:val="0"/>
-          <w:numId w:val="1021"/>
+          <w:numId w:val="1024"/>
         </w:numPr>
       </w:pPr>
       <w:r>
@@ -1957,7 +2315,7 @@
         <w:pStyle w:val="Compact"/>
         <w:numPr>
           <w:ilvl w:val="0"/>
-          <w:numId w:val="1021"/>
+          <w:numId w:val="1024"/>
         </w:numPr>
       </w:pPr>
       <w:r>
@@ -1978,7 +2336,7 @@
         <w:pStyle w:val="Compact"/>
         <w:numPr>
           <w:ilvl w:val="0"/>
-          <w:numId w:val="1021"/>
+          <w:numId w:val="1024"/>
         </w:numPr>
       </w:pPr>
       <w:r>
@@ -2007,7 +2365,7 @@
         <w:pStyle w:val="Compact"/>
         <w:numPr>
           <w:ilvl w:val="0"/>
-          <w:numId w:val="1022"/>
+          <w:numId w:val="1025"/>
         </w:numPr>
       </w:pPr>
       <w:r>
@@ -2028,7 +2386,7 @@
         <w:pStyle w:val="Compact"/>
         <w:numPr>
           <w:ilvl w:val="0"/>
-          <w:numId w:val="1022"/>
+          <w:numId w:val="1025"/>
         </w:numPr>
       </w:pPr>
       <w:r>
@@ -2049,7 +2407,7 @@
         <w:pStyle w:val="Compact"/>
         <w:numPr>
           <w:ilvl w:val="0"/>
-          <w:numId w:val="1022"/>
+          <w:numId w:val="1025"/>
         </w:numPr>
       </w:pPr>
       <w:r>
@@ -2070,7 +2428,7 @@
         <w:pStyle w:val="Compact"/>
         <w:numPr>
           <w:ilvl w:val="0"/>
-          <w:numId w:val="1022"/>
+          <w:numId w:val="1025"/>
         </w:numPr>
       </w:pPr>
       <w:r>
@@ -2093,8 +2451,8 @@
         </w:pict>
       </w:r>
     </w:p>
-    <w:bookmarkEnd w:id="26"/>
-    <w:bookmarkStart w:id="27" w:name="détail-des-comportements-par-type"/>
+    <w:bookmarkEnd w:id="27"/>
+    <w:bookmarkStart w:id="28" w:name="détail-des-comportements-par-type"/>
     <w:p>
       <w:pPr>
         <w:pStyle w:val="Heading2"/>
@@ -2103,8 +2461,8 @@
         <w:t xml:space="preserve">8) Détail des comportements par type</w:t>
       </w:r>
     </w:p>
-    <w:bookmarkEnd w:id="27"/>
-    <w:bookmarkStart w:id="28" w:name="unknown_catalog"/>
+    <w:bookmarkEnd w:id="28"/>
+    <w:bookmarkStart w:id="29" w:name="unknown_catalog"/>
     <w:p>
       <w:pPr>
         <w:pStyle w:val="Heading2"/>
@@ -2135,7 +2493,7 @@
         <w:pStyle w:val="Compact"/>
         <w:numPr>
           <w:ilvl w:val="0"/>
-          <w:numId w:val="1023"/>
+          <w:numId w:val="1026"/>
         </w:numPr>
       </w:pPr>
       <w:r>
@@ -2147,7 +2505,7 @@
         <w:pStyle w:val="Compact"/>
         <w:numPr>
           <w:ilvl w:val="0"/>
-          <w:numId w:val="1023"/>
+          <w:numId w:val="1026"/>
         </w:numPr>
       </w:pPr>
       <w:r>
@@ -2159,7 +2517,7 @@
         <w:pStyle w:val="Compact"/>
         <w:numPr>
           <w:ilvl w:val="0"/>
-          <w:numId w:val="1023"/>
+          <w:numId w:val="1026"/>
         </w:numPr>
       </w:pPr>
       <w:r>
@@ -2171,7 +2529,7 @@
         <w:pStyle w:val="Compact"/>
         <w:numPr>
           <w:ilvl w:val="0"/>
-          <w:numId w:val="1023"/>
+          <w:numId w:val="1026"/>
         </w:numPr>
       </w:pPr>
       <w:r>
@@ -2200,7 +2558,7 @@
         <w:pStyle w:val="Compact"/>
         <w:numPr>
           <w:ilvl w:val="0"/>
-          <w:numId w:val="1024"/>
+          <w:numId w:val="1027"/>
         </w:numPr>
       </w:pPr>
       <w:r>
@@ -2236,15 +2594,15 @@
         <w:pStyle w:val="Compact"/>
         <w:numPr>
           <w:ilvl w:val="0"/>
-          <w:numId w:val="1024"/>
+          <w:numId w:val="1027"/>
         </w:numPr>
       </w:pPr>
       <w:r>
         <w:t xml:space="preserve">gérer NA (laisser tel quel ou valeur personnalisée).</w:t>
       </w:r>
     </w:p>
-    <w:bookmarkEnd w:id="28"/>
-    <w:bookmarkStart w:id="29" w:name="numeric_outlier"/>
+    <w:bookmarkEnd w:id="29"/>
+    <w:bookmarkStart w:id="30" w:name="numeric_outlier"/>
     <w:p>
       <w:pPr>
         <w:pStyle w:val="Heading2"/>
@@ -2275,7 +2633,7 @@
         <w:pStyle w:val="Compact"/>
         <w:numPr>
           <w:ilvl w:val="0"/>
-          <w:numId w:val="1025"/>
+          <w:numId w:val="1028"/>
         </w:numPr>
       </w:pPr>
       <w:r>
@@ -2287,7 +2645,7 @@
         <w:pStyle w:val="Compact"/>
         <w:numPr>
           <w:ilvl w:val="0"/>
-          <w:numId w:val="1025"/>
+          <w:numId w:val="1028"/>
         </w:numPr>
       </w:pPr>
       <w:r>
@@ -2332,7 +2690,7 @@
         <w:pStyle w:val="Compact"/>
         <w:numPr>
           <w:ilvl w:val="0"/>
-          <w:numId w:val="1025"/>
+          <w:numId w:val="1028"/>
         </w:numPr>
       </w:pPr>
       <w:r>
@@ -2344,7 +2702,7 @@
         <w:pStyle w:val="Compact"/>
         <w:numPr>
           <w:ilvl w:val="0"/>
-          <w:numId w:val="1025"/>
+          <w:numId w:val="1028"/>
         </w:numPr>
       </w:pPr>
       <w:r>
@@ -2364,7 +2722,7 @@
         <w:pStyle w:val="Compact"/>
         <w:numPr>
           <w:ilvl w:val="0"/>
-          <w:numId w:val="1026"/>
+          <w:numId w:val="1029"/>
         </w:numPr>
       </w:pPr>
       <w:r>
@@ -2376,7 +2734,7 @@
         <w:pStyle w:val="Compact"/>
         <w:numPr>
           <w:ilvl w:val="1"/>
-          <w:numId w:val="1027"/>
+          <w:numId w:val="1030"/>
         </w:numPr>
       </w:pPr>
       <w:r>
@@ -2388,7 +2746,7 @@
         <w:pStyle w:val="Compact"/>
         <w:numPr>
           <w:ilvl w:val="1"/>
-          <w:numId w:val="1027"/>
+          <w:numId w:val="1030"/>
         </w:numPr>
       </w:pPr>
       <w:r>
@@ -2400,7 +2758,7 @@
         <w:pStyle w:val="Compact"/>
         <w:numPr>
           <w:ilvl w:val="1"/>
-          <w:numId w:val="1027"/>
+          <w:numId w:val="1030"/>
         </w:numPr>
       </w:pPr>
       <w:r>
@@ -2412,7 +2770,7 @@
         <w:pStyle w:val="Compact"/>
         <w:numPr>
           <w:ilvl w:val="1"/>
-          <w:numId w:val="1027"/>
+          <w:numId w:val="1030"/>
         </w:numPr>
       </w:pPr>
       <w:r>
@@ -2424,15 +2782,15 @@
         <w:pStyle w:val="Compact"/>
         <w:numPr>
           <w:ilvl w:val="0"/>
-          <w:numId w:val="1026"/>
+          <w:numId w:val="1029"/>
         </w:numPr>
       </w:pPr>
       <w:r>
         <w:t xml:space="preserve">générer un template pour outliers (décision manuelle du réviseur).</w:t>
       </w:r>
     </w:p>
-    <w:bookmarkEnd w:id="29"/>
-    <w:bookmarkStart w:id="30" w:name="outside_mission_dates"/>
+    <w:bookmarkEnd w:id="30"/>
+    <w:bookmarkStart w:id="31" w:name="outside_mission_dates"/>
     <w:p>
       <w:pPr>
         <w:pStyle w:val="Heading2"/>
@@ -2463,7 +2821,7 @@
         <w:pStyle w:val="Compact"/>
         <w:numPr>
           <w:ilvl w:val="0"/>
-          <w:numId w:val="1028"/>
+          <w:numId w:val="1031"/>
         </w:numPr>
       </w:pPr>
       <w:r>
@@ -2499,7 +2857,7 @@
         <w:pStyle w:val="Compact"/>
         <w:numPr>
           <w:ilvl w:val="0"/>
-          <w:numId w:val="1028"/>
+          <w:numId w:val="1031"/>
         </w:numPr>
       </w:pPr>
       <w:r>
@@ -2511,7 +2869,7 @@
         <w:pStyle w:val="Compact"/>
         <w:numPr>
           <w:ilvl w:val="0"/>
-          <w:numId w:val="1028"/>
+          <w:numId w:val="1031"/>
         </w:numPr>
       </w:pPr>
       <w:r>
@@ -2523,7 +2881,7 @@
         <w:pStyle w:val="Compact"/>
         <w:numPr>
           <w:ilvl w:val="1"/>
-          <w:numId w:val="1029"/>
+          <w:numId w:val="1032"/>
         </w:numPr>
       </w:pPr>
       <w:r>
@@ -2535,7 +2893,7 @@
         <w:pStyle w:val="Compact"/>
         <w:numPr>
           <w:ilvl w:val="1"/>
-          <w:numId w:val="1029"/>
+          <w:numId w:val="1032"/>
         </w:numPr>
       </w:pPr>
       <w:r>
@@ -2558,8 +2916,8 @@
         </w:pict>
       </w:r>
     </w:p>
-    <w:bookmarkEnd w:id="30"/>
-    <w:bookmarkStart w:id="31" w:name="validation-croisée-qc_cross_validation.r"/>
+    <w:bookmarkEnd w:id="31"/>
+    <w:bookmarkStart w:id="32" w:name="validation-croisée-qc_cross_validation.r"/>
     <w:p>
       <w:pPr>
         <w:pStyle w:val="Heading2"/>
@@ -2641,7 +2999,7 @@
           <w:b/>
           <w:bCs/>
         </w:rPr>
-        <w:t xml:space="preserve">R1 à R9</w:t>
+        <w:t xml:space="preserve">R1 à R11</w:t>
       </w:r>
       <w:r>
         <w:t xml:space="preserve"> </w:t>
@@ -2675,7 +3033,7 @@
         <w:pStyle w:val="Compact"/>
         <w:numPr>
           <w:ilvl w:val="0"/>
-          <w:numId w:val="1030"/>
+          <w:numId w:val="1033"/>
         </w:numPr>
       </w:pPr>
       <w:r>
@@ -2714,7 +3072,7 @@
         <w:pStyle w:val="Compact"/>
         <w:numPr>
           <w:ilvl w:val="0"/>
-          <w:numId w:val="1030"/>
+          <w:numId w:val="1033"/>
         </w:numPr>
       </w:pPr>
       <w:r>
@@ -2738,7 +3096,7 @@
         <w:pStyle w:val="Compact"/>
         <w:numPr>
           <w:ilvl w:val="0"/>
-          <w:numId w:val="1030"/>
+          <w:numId w:val="1033"/>
         </w:numPr>
       </w:pPr>
       <w:r>
@@ -2750,7 +3108,7 @@
         <w:pStyle w:val="Compact"/>
         <w:numPr>
           <w:ilvl w:val="0"/>
-          <w:numId w:val="1030"/>
+          <w:numId w:val="1033"/>
         </w:numPr>
       </w:pPr>
       <w:r>
@@ -2792,7 +3150,7 @@
         <w:pStyle w:val="Compact"/>
         <w:numPr>
           <w:ilvl w:val="0"/>
-          <w:numId w:val="1030"/>
+          <w:numId w:val="1033"/>
         </w:numPr>
       </w:pPr>
       <w:r>
@@ -2826,7 +3184,55 @@
         <w:t xml:space="preserve"> </w:t>
       </w:r>
       <w:r>
-        <w:t xml:space="preserve">pour missions double protocole.</w:t>
+        <w:t xml:space="preserve">pour missions double protocole,</w:t>
+      </w:r>
+    </w:p>
+    <w:p>
+      <w:pPr>
+        <w:pStyle w:val="Compact"/>
+        <w:numPr>
+          <w:ilvl w:val="0"/>
+          <w:numId w:val="1033"/>
+        </w:numPr>
+      </w:pPr>
+      <w:r>
+        <w:t xml:space="preserve">cohérence distance/durée/vitesse sur transects (R10),</w:t>
+      </w:r>
+    </w:p>
+    <w:p>
+      <w:pPr>
+        <w:pStyle w:val="Compact"/>
+        <w:numPr>
+          <w:ilvl w:val="0"/>
+          <w:numId w:val="1033"/>
+        </w:numPr>
+      </w:pPr>
+      <w:r>
+        <w:t xml:space="preserve">intégrité des extrémités</w:t>
+      </w:r>
+      <w:r>
+        <w:t xml:space="preserve"> </w:t>
+      </w:r>
+      <w:r>
+        <w:rPr>
+          <w:rStyle w:val="VerbatimChar"/>
+        </w:rPr>
+        <w:t xml:space="preserve">Début</w:t>
+      </w:r>
+      <w:r>
+        <w:t xml:space="preserve">/</w:t>
+      </w:r>
+      <w:r>
+        <w:rPr>
+          <w:rStyle w:val="VerbatimChar"/>
+        </w:rPr>
+        <w:t xml:space="preserve">Fin</w:t>
+      </w:r>
+      <w:r>
+        <w:t xml:space="preserve"> </w:t>
+      </w:r>
+      <w:r>
+        <w:t xml:space="preserve">de transects (R11).</w:t>
       </w:r>
     </w:p>
     <w:p>
@@ -2834,7 +3240,538 @@
         <w:pStyle w:val="FirstParagraph"/>
       </w:pPr>
       <w:r>
-        <w:t xml:space="preserve">Pour certaines règles (R4, R6, R7), le script peut proposer un snippet prêt à ajouter.</w:t>
+        <w:t xml:space="preserve">Pour certaines règles (dont R4, R6, R7, R10, R11), le script peut proposer un snippet prêt à ajouter.</w:t>
+      </w:r>
+    </w:p>
+    <w:bookmarkEnd w:id="32"/>
+    <w:bookmarkStart w:id="33" w:name="résumé-rapide-r1r11"/>
+    <w:p>
+      <w:pPr>
+        <w:pStyle w:val="Heading2"/>
+      </w:pPr>
+      <w:r>
+        <w:t xml:space="preserve">9.1 Résumé rapide R1–R11</w:t>
+      </w:r>
+    </w:p>
+    <w:p>
+      <w:pPr>
+        <w:pStyle w:val="Compact"/>
+        <w:numPr>
+          <w:ilvl w:val="0"/>
+          <w:numId w:val="1034"/>
+        </w:numPr>
+      </w:pPr>
+      <w:r>
+        <w:rPr>
+          <w:b/>
+          <w:bCs/>
+        </w:rPr>
+        <w:t xml:space="preserve">R1</w:t>
+      </w:r>
+      <w:r>
+        <w:t xml:space="preserve"> </w:t>
+      </w:r>
+      <w:r>
+        <w:t xml:space="preserve">:</w:t>
+      </w:r>
+      <w:r>
+        <w:t xml:space="preserve"> </w:t>
+      </w:r>
+      <w:r>
+        <w:rPr>
+          <w:rStyle w:val="VerbatimChar"/>
+        </w:rPr>
+        <w:t xml:space="preserve">id_transect</w:t>
+      </w:r>
+      <w:r>
+        <w:t xml:space="preserve"> </w:t>
+      </w:r>
+      <w:r>
+        <w:t xml:space="preserve">manquant hors</w:t>
+      </w:r>
+      <w:r>
+        <w:t xml:space="preserve"> </w:t>
+      </w:r>
+      <w:r>
+        <w:rPr>
+          <w:rStyle w:val="VerbatimChar"/>
+        </w:rPr>
+        <w:t xml:space="preserve">HORS TRANSECT</w:t>
+      </w:r>
+      <w:r>
+        <w:t xml:space="preserve">.</w:t>
+      </w:r>
+    </w:p>
+    <w:p>
+      <w:pPr>
+        <w:pStyle w:val="Compact"/>
+        <w:numPr>
+          <w:ilvl w:val="0"/>
+          <w:numId w:val="1034"/>
+        </w:numPr>
+      </w:pPr>
+      <w:r>
+        <w:rPr>
+          <w:b/>
+          <w:bCs/>
+        </w:rPr>
+        <w:t xml:space="preserve">R2</w:t>
+      </w:r>
+      <w:r>
+        <w:t xml:space="preserve"> </w:t>
+      </w:r>
+      <w:r>
+        <w:t xml:space="preserve">:</w:t>
+      </w:r>
+      <w:r>
+        <w:t xml:space="preserve"> </w:t>
+      </w:r>
+      <w:r>
+        <w:rPr>
+          <w:rStyle w:val="VerbatimChar"/>
+        </w:rPr>
+        <w:t xml:space="preserve">code_espece = RIEN</w:t>
+      </w:r>
+      <w:r>
+        <w:t xml:space="preserve"> </w:t>
+      </w:r>
+      <w:r>
+        <w:t xml:space="preserve">avec champs espèce non-NA.</w:t>
+      </w:r>
+    </w:p>
+    <w:p>
+      <w:pPr>
+        <w:pStyle w:val="Compact"/>
+        <w:numPr>
+          <w:ilvl w:val="0"/>
+          <w:numId w:val="1034"/>
+        </w:numPr>
+      </w:pPr>
+      <w:r>
+        <w:rPr>
+          <w:b/>
+          <w:bCs/>
+        </w:rPr>
+        <w:t xml:space="preserve">R3</w:t>
+      </w:r>
+      <w:r>
+        <w:t xml:space="preserve"> </w:t>
+      </w:r>
+      <w:r>
+        <w:t xml:space="preserve">:</w:t>
+      </w:r>
+      <w:r>
+        <w:t xml:space="preserve"> </w:t>
+      </w:r>
+      <w:r>
+        <w:rPr>
+          <w:rStyle w:val="VerbatimChar"/>
+        </w:rPr>
+        <w:t xml:space="preserve">code_espece != RIEN</w:t>
+      </w:r>
+      <w:r>
+        <w:t xml:space="preserve"> </w:t>
+      </w:r>
+      <w:r>
+        <w:t xml:space="preserve">avec</w:t>
+      </w:r>
+      <w:r>
+        <w:t xml:space="preserve"> </w:t>
+      </w:r>
+      <w:r>
+        <w:rPr>
+          <w:rStyle w:val="VerbatimChar"/>
+        </w:rPr>
+        <w:t xml:space="preserve">nb_individu</w:t>
+      </w:r>
+      <w:r>
+        <w:t xml:space="preserve"> </w:t>
+      </w:r>
+      <w:r>
+        <w:t xml:space="preserve">ou</w:t>
+      </w:r>
+      <w:r>
+        <w:t xml:space="preserve"> </w:t>
+      </w:r>
+      <w:r>
+        <w:rPr>
+          <w:rStyle w:val="VerbatimChar"/>
+        </w:rPr>
+        <w:t xml:space="preserve">activite</w:t>
+      </w:r>
+      <w:r>
+        <w:t xml:space="preserve"> </w:t>
+      </w:r>
+      <w:r>
+        <w:t xml:space="preserve">manquant.</w:t>
+      </w:r>
+    </w:p>
+    <w:p>
+      <w:pPr>
+        <w:pStyle w:val="Compact"/>
+        <w:numPr>
+          <w:ilvl w:val="0"/>
+          <w:numId w:val="1034"/>
+        </w:numPr>
+      </w:pPr>
+      <w:r>
+        <w:rPr>
+          <w:b/>
+          <w:bCs/>
+        </w:rPr>
+        <w:t xml:space="preserve">R4</w:t>
+      </w:r>
+      <w:r>
+        <w:t xml:space="preserve"> </w:t>
+      </w:r>
+      <w:r>
+        <w:t xml:space="preserve">: distances attendues manquantes selon protocole.</w:t>
+      </w:r>
+    </w:p>
+    <w:p>
+      <w:pPr>
+        <w:pStyle w:val="Compact"/>
+        <w:numPr>
+          <w:ilvl w:val="0"/>
+          <w:numId w:val="1034"/>
+        </w:numPr>
+      </w:pPr>
+      <w:r>
+        <w:rPr>
+          <w:b/>
+          <w:bCs/>
+        </w:rPr>
+        <w:t xml:space="preserve">R5</w:t>
+      </w:r>
+      <w:r>
+        <w:t xml:space="preserve"> </w:t>
+      </w:r>
+      <w:r>
+        <w:t xml:space="preserve">: données</w:t>
+      </w:r>
+      <w:r>
+        <w:t xml:space="preserve"> </w:t>
+      </w:r>
+      <w:r>
+        <w:rPr>
+          <w:rStyle w:val="VerbatimChar"/>
+        </w:rPr>
+        <w:t xml:space="preserve">_rad</w:t>
+      </w:r>
+      <w:r>
+        <w:t xml:space="preserve"> </w:t>
+      </w:r>
+      <w:r>
+        <w:t xml:space="preserve">présentes dans mission</w:t>
+      </w:r>
+      <w:r>
+        <w:t xml:space="preserve"> </w:t>
+      </w:r>
+      <w:r>
+        <w:rPr>
+          <w:rStyle w:val="VerbatimChar"/>
+        </w:rPr>
+        <w:t xml:space="preserve">_par</w:t>
+      </w:r>
+      <w:r>
+        <w:t xml:space="preserve">-only.</w:t>
+      </w:r>
+    </w:p>
+    <w:p>
+      <w:pPr>
+        <w:pStyle w:val="Compact"/>
+        <w:numPr>
+          <w:ilvl w:val="0"/>
+          <w:numId w:val="1034"/>
+        </w:numPr>
+      </w:pPr>
+      <w:r>
+        <w:rPr>
+          <w:b/>
+          <w:bCs/>
+        </w:rPr>
+        <w:t xml:space="preserve">R6</w:t>
+      </w:r>
+      <w:r>
+        <w:t xml:space="preserve"> </w:t>
+      </w:r>
+      <w:r>
+        <w:t xml:space="preserve">:</w:t>
+      </w:r>
+      <w:r>
+        <w:t xml:space="preserve"> </w:t>
+      </w:r>
+      <w:r>
+        <w:rPr>
+          <w:rStyle w:val="VerbatimChar"/>
+        </w:rPr>
+        <w:t xml:space="preserve">activite = VOL</w:t>
+      </w:r>
+      <w:r>
+        <w:t xml:space="preserve"> </w:t>
+      </w:r>
+      <w:r>
+        <w:t xml:space="preserve">mais</w:t>
+      </w:r>
+      <w:r>
+        <w:t xml:space="preserve"> </w:t>
+      </w:r>
+      <w:r>
+        <w:rPr>
+          <w:rStyle w:val="VerbatimChar"/>
+        </w:rPr>
+        <w:t xml:space="preserve">snapshot != OUI</w:t>
+      </w:r>
+      <w:r>
+        <w:t xml:space="preserve">.</w:t>
+      </w:r>
+    </w:p>
+    <w:p>
+      <w:pPr>
+        <w:pStyle w:val="Compact"/>
+        <w:numPr>
+          <w:ilvl w:val="0"/>
+          <w:numId w:val="1034"/>
+        </w:numPr>
+      </w:pPr>
+      <w:r>
+        <w:rPr>
+          <w:b/>
+          <w:bCs/>
+        </w:rPr>
+        <w:t xml:space="preserve">R7</w:t>
+      </w:r>
+      <w:r>
+        <w:t xml:space="preserve"> </w:t>
+      </w:r>
+      <w:r>
+        <w:t xml:space="preserve">:</w:t>
+      </w:r>
+      <w:r>
+        <w:t xml:space="preserve"> </w:t>
+      </w:r>
+      <w:r>
+        <w:rPr>
+          <w:rStyle w:val="VerbatimChar"/>
+        </w:rPr>
+        <w:t xml:space="preserve">activite = EAU</w:t>
+      </w:r>
+      <w:r>
+        <w:t xml:space="preserve"> </w:t>
+      </w:r>
+      <w:r>
+        <w:t xml:space="preserve">mais</w:t>
+      </w:r>
+      <w:r>
+        <w:t xml:space="preserve"> </w:t>
+      </w:r>
+      <w:r>
+        <w:rPr>
+          <w:rStyle w:val="VerbatimChar"/>
+        </w:rPr>
+        <w:t xml:space="preserve">snapshot != NON</w:t>
+      </w:r>
+      <w:r>
+        <w:t xml:space="preserve">.</w:t>
+      </w:r>
+    </w:p>
+    <w:p>
+      <w:pPr>
+        <w:pStyle w:val="Compact"/>
+        <w:numPr>
+          <w:ilvl w:val="0"/>
+          <w:numId w:val="1034"/>
+        </w:numPr>
+      </w:pPr>
+      <w:r>
+        <w:rPr>
+          <w:b/>
+          <w:bCs/>
+        </w:rPr>
+        <w:t xml:space="preserve">R8</w:t>
+      </w:r>
+      <w:r>
+        <w:t xml:space="preserve"> </w:t>
+      </w:r>
+      <w:r>
+        <w:t xml:space="preserve">:</w:t>
+      </w:r>
+      <w:r>
+        <w:t xml:space="preserve"> </w:t>
+      </w:r>
+      <w:r>
+        <w:rPr>
+          <w:rStyle w:val="VerbatimChar"/>
+        </w:rPr>
+        <w:t xml:space="preserve">in_transect</w:t>
+      </w:r>
+      <w:r>
+        <w:t xml:space="preserve"> </w:t>
+      </w:r>
+      <w:r>
+        <w:t xml:space="preserve">ou</w:t>
+      </w:r>
+      <w:r>
+        <w:t xml:space="preserve"> </w:t>
+      </w:r>
+      <w:r>
+        <w:rPr>
+          <w:rStyle w:val="VerbatimChar"/>
+        </w:rPr>
+        <w:t xml:space="preserve">snapshot</w:t>
+      </w:r>
+      <w:r>
+        <w:t xml:space="preserve"> </w:t>
+      </w:r>
+      <w:r>
+        <w:t xml:space="preserve">manquant sur non-RIEN.</w:t>
+      </w:r>
+    </w:p>
+    <w:p>
+      <w:pPr>
+        <w:pStyle w:val="Compact"/>
+        <w:numPr>
+          <w:ilvl w:val="0"/>
+          <w:numId w:val="1034"/>
+        </w:numPr>
+      </w:pPr>
+      <w:r>
+        <w:rPr>
+          <w:b/>
+          <w:bCs/>
+        </w:rPr>
+        <w:t xml:space="preserve">R9</w:t>
+      </w:r>
+      <w:r>
+        <w:t xml:space="preserve"> </w:t>
+      </w:r>
+      <w:r>
+        <w:t xml:space="preserve">: divergence</w:t>
+      </w:r>
+      <w:r>
+        <w:t xml:space="preserve"> </w:t>
+      </w:r>
+      <w:r>
+        <w:rPr>
+          <w:rStyle w:val="VerbatimChar"/>
+        </w:rPr>
+        <w:t xml:space="preserve">_rad</w:t>
+      </w:r>
+      <w:r>
+        <w:t xml:space="preserve"> </w:t>
+      </w:r>
+      <w:r>
+        <w:t xml:space="preserve">vs</w:t>
+      </w:r>
+      <w:r>
+        <w:t xml:space="preserve"> </w:t>
+      </w:r>
+      <w:r>
+        <w:rPr>
+          <w:rStyle w:val="VerbatimChar"/>
+        </w:rPr>
+        <w:t xml:space="preserve">_par</w:t>
+      </w:r>
+      <w:r>
+        <w:t xml:space="preserve"> </w:t>
+      </w:r>
+      <w:r>
+        <w:t xml:space="preserve">(double protocole).</w:t>
+      </w:r>
+    </w:p>
+    <w:p>
+      <w:pPr>
+        <w:pStyle w:val="Compact"/>
+        <w:numPr>
+          <w:ilvl w:val="0"/>
+          <w:numId w:val="1034"/>
+        </w:numPr>
+      </w:pPr>
+      <w:r>
+        <w:rPr>
+          <w:b/>
+          <w:bCs/>
+        </w:rPr>
+        <w:t xml:space="preserve">R10</w:t>
+      </w:r>
+      <w:r>
+        <w:t xml:space="preserve"> </w:t>
+      </w:r>
+      <w:r>
+        <w:t xml:space="preserve">: incohérence transect distance/durée/vitesse.</w:t>
+      </w:r>
+    </w:p>
+    <w:p>
+      <w:pPr>
+        <w:pStyle w:val="Compact"/>
+        <w:numPr>
+          <w:ilvl w:val="0"/>
+          <w:numId w:val="1034"/>
+        </w:numPr>
+      </w:pPr>
+      <w:r>
+        <w:rPr>
+          <w:b/>
+          <w:bCs/>
+        </w:rPr>
+        <w:t xml:space="preserve">R11</w:t>
+      </w:r>
+      <w:r>
+        <w:t xml:space="preserve"> </w:t>
+      </w:r>
+      <w:r>
+        <w:t xml:space="preserve">: intégrité</w:t>
+      </w:r>
+      <w:r>
+        <w:t xml:space="preserve"> </w:t>
+      </w:r>
+      <w:r>
+        <w:rPr>
+          <w:rStyle w:val="VerbatimChar"/>
+        </w:rPr>
+        <w:t xml:space="preserve">Début</w:t>
+      </w:r>
+      <w:r>
+        <w:t xml:space="preserve">/</w:t>
+      </w:r>
+      <w:r>
+        <w:rPr>
+          <w:rStyle w:val="VerbatimChar"/>
+        </w:rPr>
+        <w:t xml:space="preserve">Fin</w:t>
+      </w:r>
+      <w:r>
+        <w:t xml:space="preserve"> </w:t>
+      </w:r>
+      <w:r>
+        <w:t xml:space="preserve">(manquant/dupliqué).</w:t>
+      </w:r>
+    </w:p>
+    <w:bookmarkEnd w:id="33"/>
+    <w:bookmarkStart w:id="34" w:name="note-pratique-r10"/>
+    <w:p>
+      <w:pPr>
+        <w:pStyle w:val="Heading2"/>
+      </w:pPr>
+      <w:r>
+        <w:t xml:space="preserve">9.2 Note pratique R10</w:t>
+      </w:r>
+    </w:p>
+    <w:p>
+      <w:pPr>
+        <w:pStyle w:val="FirstParagraph"/>
+      </w:pPr>
+      <w:r>
+        <w:t xml:space="preserve">R10 n’est pas appliquée aux missions avion (</w:t>
+      </w:r>
+      <w:r>
+        <w:rPr>
+          <w:rStyle w:val="VerbatimChar"/>
+        </w:rPr>
+        <w:t xml:space="preserve">^AVI|^PAR|^ISL</w:t>
+      </w:r>
+      <w:r>
+        <w:t xml:space="preserve">).</w:t>
       </w:r>
     </w:p>
     <w:p>
@@ -2844,8 +3781,8 @@
         </w:pict>
       </w:r>
     </w:p>
-    <w:bookmarkEnd w:id="31"/>
-    <w:bookmarkStart w:id="32" w:name="gestion-du-script-de-corrections"/>
+    <w:bookmarkEnd w:id="34"/>
+    <w:bookmarkStart w:id="35" w:name="gestion-du-script-de-corrections"/>
     <w:p>
       <w:pPr>
         <w:pStyle w:val="Heading2"/>
@@ -2891,7 +3828,7 @@
         <w:pStyle w:val="Compact"/>
         <w:numPr>
           <w:ilvl w:val="0"/>
-          <w:numId w:val="1031"/>
+          <w:numId w:val="1035"/>
         </w:numPr>
       </w:pPr>
       <w:r>
@@ -2915,7 +3852,7 @@
         <w:pStyle w:val="Compact"/>
         <w:numPr>
           <w:ilvl w:val="0"/>
-          <w:numId w:val="1031"/>
+          <w:numId w:val="1035"/>
         </w:numPr>
       </w:pPr>
       <w:r>
@@ -2927,7 +3864,7 @@
         <w:pStyle w:val="Compact"/>
         <w:numPr>
           <w:ilvl w:val="1"/>
-          <w:numId w:val="1032"/>
+          <w:numId w:val="1036"/>
         </w:numPr>
       </w:pPr>
       <w:r>
@@ -2957,7 +3894,7 @@
         <w:pStyle w:val="Compact"/>
         <w:numPr>
           <w:ilvl w:val="0"/>
-          <w:numId w:val="1031"/>
+          <w:numId w:val="1035"/>
         </w:numPr>
       </w:pPr>
       <w:r>
@@ -2969,7 +3906,7 @@
         <w:pStyle w:val="Compact"/>
         <w:numPr>
           <w:ilvl w:val="0"/>
-          <w:numId w:val="1031"/>
+          <w:numId w:val="1035"/>
         </w:numPr>
       </w:pPr>
       <w:r>
@@ -2981,7 +3918,7 @@
         <w:pStyle w:val="Compact"/>
         <w:numPr>
           <w:ilvl w:val="1"/>
-          <w:numId w:val="1033"/>
+          <w:numId w:val="1037"/>
         </w:numPr>
       </w:pPr>
       <w:r>
@@ -2993,15 +3930,15 @@
         <w:pStyle w:val="Compact"/>
         <w:numPr>
           <w:ilvl w:val="0"/>
-          <w:numId w:val="1031"/>
+          <w:numId w:val="1035"/>
         </w:numPr>
       </w:pPr>
       <w:r>
         <w:t xml:space="preserve">propose d’ajouter/rafraîchir le bloc de fermeture.</w:t>
       </w:r>
     </w:p>
-    <w:bookmarkEnd w:id="32"/>
-    <w:bookmarkStart w:id="33" w:name="bloc-douverture"/>
+    <w:bookmarkEnd w:id="35"/>
+    <w:bookmarkStart w:id="36" w:name="bloc-douverture"/>
     <w:p>
       <w:pPr>
         <w:pStyle w:val="Heading2"/>
@@ -3069,8 +4006,8 @@
         <w:t xml:space="preserve">.</w:t>
       </w:r>
     </w:p>
-    <w:bookmarkEnd w:id="33"/>
-    <w:bookmarkStart w:id="34" w:name="bloc-de-fermeture"/>
+    <w:bookmarkEnd w:id="36"/>
+    <w:bookmarkStart w:id="37" w:name="bloc-de-fermeture"/>
     <w:p>
       <w:pPr>
         <w:pStyle w:val="Heading2"/>
@@ -3084,7 +4021,7 @@
         <w:pStyle w:val="Compact"/>
         <w:numPr>
           <w:ilvl w:val="0"/>
-          <w:numId w:val="1034"/>
+          <w:numId w:val="1038"/>
         </w:numPr>
       </w:pPr>
       <w:r>
@@ -3096,7 +4033,7 @@
         <w:pStyle w:val="Compact"/>
         <w:numPr>
           <w:ilvl w:val="0"/>
-          <w:numId w:val="1034"/>
+          <w:numId w:val="1038"/>
         </w:numPr>
       </w:pPr>
       <w:r>
@@ -3108,7 +4045,7 @@
         <w:pStyle w:val="Compact"/>
         <w:numPr>
           <w:ilvl w:val="1"/>
-          <w:numId w:val="1035"/>
+          <w:numId w:val="1039"/>
         </w:numPr>
       </w:pPr>
       <w:r>
@@ -3120,7 +4057,7 @@
         <w:pStyle w:val="Compact"/>
         <w:numPr>
           <w:ilvl w:val="1"/>
-          <w:numId w:val="1035"/>
+          <w:numId w:val="1039"/>
         </w:numPr>
       </w:pPr>
       <w:r>
@@ -3146,8 +4083,8 @@
         </w:pict>
       </w:r>
     </w:p>
-    <w:bookmarkEnd w:id="34"/>
-    <w:bookmarkStart w:id="35" w:name="flux-recommandé-opérationnel"/>
+    <w:bookmarkEnd w:id="37"/>
+    <w:bookmarkStart w:id="38" w:name="flux-recommandé-opérationnel"/>
     <w:p>
       <w:pPr>
         <w:pStyle w:val="Heading2"/>
@@ -3161,7 +4098,7 @@
         <w:pStyle w:val="Compact"/>
         <w:numPr>
           <w:ilvl w:val="0"/>
-          <w:numId w:val="1036"/>
+          <w:numId w:val="1040"/>
         </w:numPr>
       </w:pPr>
       <w:r>
@@ -3216,7 +4153,7 @@
         <w:pStyle w:val="Compact"/>
         <w:numPr>
           <w:ilvl w:val="0"/>
-          <w:numId w:val="1036"/>
+          <w:numId w:val="1040"/>
         </w:numPr>
       </w:pPr>
       <w:r>
@@ -3228,7 +4165,7 @@
         <w:pStyle w:val="Compact"/>
         <w:numPr>
           <w:ilvl w:val="1"/>
-          <w:numId w:val="1037"/>
+          <w:numId w:val="1041"/>
         </w:numPr>
       </w:pPr>
       <w:r>
@@ -3243,7 +4180,7 @@
         <w:pStyle w:val="Compact"/>
         <w:numPr>
           <w:ilvl w:val="1"/>
-          <w:numId w:val="1037"/>
+          <w:numId w:val="1041"/>
         </w:numPr>
       </w:pPr>
       <w:r>
@@ -3258,7 +4195,7 @@
         <w:pStyle w:val="Compact"/>
         <w:numPr>
           <w:ilvl w:val="1"/>
-          <w:numId w:val="1037"/>
+          <w:numId w:val="1041"/>
         </w:numPr>
       </w:pPr>
       <w:r>
@@ -3273,7 +4210,46 @@
         <w:pStyle w:val="Compact"/>
         <w:numPr>
           <w:ilvl w:val="0"/>
-          <w:numId w:val="1036"/>
+          <w:numId w:val="1040"/>
+        </w:numPr>
+      </w:pPr>
+      <w:r>
+        <w:t xml:space="preserve">(Option recommandé) Lancer</w:t>
+      </w:r>
+      <w:r>
+        <w:t xml:space="preserve"> </w:t>
+      </w:r>
+      <w:r>
+        <w:rPr>
+          <w:rStyle w:val="VerbatimChar"/>
+        </w:rPr>
+        <w:t xml:space="preserve">mission_error_inventory.R</w:t>
+      </w:r>
+      <w:r>
+        <w:t xml:space="preserve"> </w:t>
+      </w:r>
+      <w:r>
+        <w:t xml:space="preserve">pour générer</w:t>
+      </w:r>
+      <w:r>
+        <w:t xml:space="preserve"> </w:t>
+      </w:r>
+      <w:r>
+        <w:rPr>
+          <w:rStyle w:val="VerbatimChar"/>
+        </w:rPr>
+        <w:t xml:space="preserve">MissionReports/mission_error_summary_&lt;ACCDB_TAG&gt;.xlsx</w:t>
+      </w:r>
+      <w:r>
+        <w:t xml:space="preserve">.</w:t>
+      </w:r>
+    </w:p>
+    <w:p>
+      <w:pPr>
+        <w:pStyle w:val="Compact"/>
+        <w:numPr>
+          <w:ilvl w:val="0"/>
+          <w:numId w:val="1040"/>
         </w:numPr>
       </w:pPr>
       <w:r>
@@ -3285,7 +4261,7 @@
         <w:pStyle w:val="Compact"/>
         <w:numPr>
           <w:ilvl w:val="0"/>
-          <w:numId w:val="1036"/>
+          <w:numId w:val="1040"/>
         </w:numPr>
       </w:pPr>
       <w:r>
@@ -3297,7 +4273,7 @@
         <w:pStyle w:val="Compact"/>
         <w:numPr>
           <w:ilvl w:val="0"/>
-          <w:numId w:val="1036"/>
+          <w:numId w:val="1040"/>
         </w:numPr>
       </w:pPr>
       <w:r>
@@ -3309,7 +4285,7 @@
         <w:pStyle w:val="Compact"/>
         <w:numPr>
           <w:ilvl w:val="1"/>
-          <w:numId w:val="1038"/>
+          <w:numId w:val="1042"/>
         </w:numPr>
       </w:pPr>
       <w:r>
@@ -3321,7 +4297,7 @@
         <w:pStyle w:val="Compact"/>
         <w:numPr>
           <w:ilvl w:val="1"/>
-          <w:numId w:val="1038"/>
+          <w:numId w:val="1042"/>
         </w:numPr>
       </w:pPr>
       <w:r>
@@ -3333,7 +4309,7 @@
         <w:pStyle w:val="Compact"/>
         <w:numPr>
           <w:ilvl w:val="1"/>
-          <w:numId w:val="1038"/>
+          <w:numId w:val="1042"/>
         </w:numPr>
       </w:pPr>
       <w:r>
@@ -3345,7 +4321,7 @@
         <w:pStyle w:val="Compact"/>
         <w:numPr>
           <w:ilvl w:val="1"/>
-          <w:numId w:val="1038"/>
+          <w:numId w:val="1042"/>
         </w:numPr>
       </w:pPr>
       <w:r>
@@ -3357,7 +4333,7 @@
         <w:pStyle w:val="Compact"/>
         <w:numPr>
           <w:ilvl w:val="0"/>
-          <w:numId w:val="1036"/>
+          <w:numId w:val="1040"/>
         </w:numPr>
       </w:pPr>
       <w:r>
@@ -3369,7 +4345,7 @@
         <w:pStyle w:val="Compact"/>
         <w:numPr>
           <w:ilvl w:val="0"/>
-          <w:numId w:val="1036"/>
+          <w:numId w:val="1040"/>
         </w:numPr>
       </w:pPr>
       <w:r>
@@ -3381,7 +4357,7 @@
         <w:pStyle w:val="Compact"/>
         <w:numPr>
           <w:ilvl w:val="0"/>
-          <w:numId w:val="1036"/>
+          <w:numId w:val="1040"/>
         </w:numPr>
       </w:pPr>
       <w:r>
@@ -3405,7 +4381,7 @@
         <w:pStyle w:val="Compact"/>
         <w:numPr>
           <w:ilvl w:val="0"/>
-          <w:numId w:val="1036"/>
+          <w:numId w:val="1040"/>
         </w:numPr>
       </w:pPr>
       <w:r>
@@ -3417,11 +4393,386 @@
         <w:pStyle w:val="Compact"/>
         <w:numPr>
           <w:ilvl w:val="0"/>
-          <w:numId w:val="1036"/>
-        </w:numPr>
-      </w:pPr>
-      <w:r>
-        <w:t xml:space="preserve">Rejouer une passe QA rapide pour confirmer.</w:t>
+          <w:numId w:val="1040"/>
+        </w:numPr>
+      </w:pPr>
+      <w:r>
+        <w:t xml:space="preserve">Rejouer</w:t>
+      </w:r>
+      <w:r>
+        <w:t xml:space="preserve"> </w:t>
+      </w:r>
+      <w:r>
+        <w:rPr>
+          <w:rStyle w:val="VerbatimChar"/>
+        </w:rPr>
+        <w:t xml:space="preserve">mission_error_inventory.R</w:t>
+      </w:r>
+      <w:r>
+        <w:t xml:space="preserve"> </w:t>
+      </w:r>
+      <w:r>
+        <w:t xml:space="preserve">et une passe QA rapide pour confirmer la réduction des enjeux.</w:t>
+      </w:r>
+    </w:p>
+    <w:bookmarkEnd w:id="38"/>
+    <w:bookmarkStart w:id="39" w:name="X02879836d8bcee8dc20675dc49bcba3864cb6ca"/>
+    <w:p>
+      <w:pPr>
+        <w:pStyle w:val="Heading2"/>
+      </w:pPr>
+      <w:r>
+        <w:t xml:space="preserve">11.1 Utilisation de</w:t>
+      </w:r>
+      <w:r>
+        <w:t xml:space="preserve"> </w:t>
+      </w:r>
+      <w:r>
+        <w:rPr>
+          <w:rStyle w:val="VerbatimChar"/>
+        </w:rPr>
+        <w:t xml:space="preserve">force_rebuild</w:t>
+      </w:r>
+      <w:r>
+        <w:t xml:space="preserve"> </w:t>
+      </w:r>
+      <w:r>
+        <w:t xml:space="preserve">/</w:t>
+      </w:r>
+      <w:r>
+        <w:t xml:space="preserve"> </w:t>
+      </w:r>
+      <w:r>
+        <w:rPr>
+          <w:rStyle w:val="VerbatimChar"/>
+        </w:rPr>
+        <w:t xml:space="preserve">force_rebuild_issues</w:t>
+      </w:r>
+    </w:p>
+    <w:p>
+      <w:pPr>
+        <w:pStyle w:val="FirstParagraph"/>
+      </w:pPr>
+      <w:r>
+        <w:t xml:space="preserve">Dans</w:t>
+      </w:r>
+      <w:r>
+        <w:t xml:space="preserve"> </w:t>
+      </w:r>
+      <w:r>
+        <w:rPr>
+          <w:rStyle w:val="VerbatimChar"/>
+        </w:rPr>
+        <w:t xml:space="preserve">mission_profiler_somerc_v6_3_4.R</w:t>
+      </w:r>
+      <w:r>
+        <w:t xml:space="preserve"> </w:t>
+      </w:r>
+      <w:r>
+        <w:t xml:space="preserve">:</w:t>
+      </w:r>
+    </w:p>
+    <w:p>
+      <w:pPr>
+        <w:pStyle w:val="Compact"/>
+        <w:numPr>
+          <w:ilvl w:val="0"/>
+          <w:numId w:val="1043"/>
+        </w:numPr>
+      </w:pPr>
+      <w:r>
+        <w:rPr>
+          <w:rStyle w:val="VerbatimChar"/>
+        </w:rPr>
+        <w:t xml:space="preserve">force_rebuild = TRUE</w:t>
+      </w:r>
+      <w:r>
+        <w:t xml:space="preserve"> </w:t>
+      </w:r>
+      <w:r>
+        <w:t xml:space="preserve">: reconstruit tous les Excel + index +</w:t>
+      </w:r>
+      <w:r>
+        <w:t xml:space="preserve"> </w:t>
+      </w:r>
+      <w:r>
+        <w:rPr>
+          <w:rStyle w:val="VerbatimChar"/>
+        </w:rPr>
+        <w:t xml:space="preserve">mission_issues.rds</w:t>
+      </w:r>
+      <w:r>
+        <w:t xml:space="preserve">.</w:t>
+      </w:r>
+    </w:p>
+    <w:p>
+      <w:pPr>
+        <w:pStyle w:val="Compact"/>
+        <w:numPr>
+          <w:ilvl w:val="0"/>
+          <w:numId w:val="1043"/>
+        </w:numPr>
+      </w:pPr>
+      <w:r>
+        <w:rPr>
+          <w:rStyle w:val="VerbatimChar"/>
+        </w:rPr>
+        <w:t xml:space="preserve">force_rebuild = FALSE</w:t>
+      </w:r>
+      <w:r>
+        <w:t xml:space="preserve"> </w:t>
+      </w:r>
+      <w:r>
+        <w:t xml:space="preserve">et</w:t>
+      </w:r>
+      <w:r>
+        <w:t xml:space="preserve"> </w:t>
+      </w:r>
+      <w:r>
+        <w:rPr>
+          <w:rStyle w:val="VerbatimChar"/>
+        </w:rPr>
+        <w:t xml:space="preserve">force_rebuild_issues = TRUE</w:t>
+      </w:r>
+      <w:r>
+        <w:t xml:space="preserve"> </w:t>
+      </w:r>
+      <w:r>
+        <w:t xml:space="preserve">: met à jour</w:t>
+      </w:r>
+      <w:r>
+        <w:t xml:space="preserve"> </w:t>
+      </w:r>
+      <w:r>
+        <w:rPr>
+          <w:rStyle w:val="VerbatimChar"/>
+        </w:rPr>
+        <w:t xml:space="preserve">mission_issues.rds</w:t>
+      </w:r>
+      <w:r>
+        <w:t xml:space="preserve"> </w:t>
+      </w:r>
+      <w:r>
+        <w:t xml:space="preserve">sans réécrire les Excel.</w:t>
+      </w:r>
+    </w:p>
+    <w:p>
+      <w:pPr>
+        <w:pStyle w:val="Compact"/>
+        <w:numPr>
+          <w:ilvl w:val="0"/>
+          <w:numId w:val="1043"/>
+        </w:numPr>
+      </w:pPr>
+      <w:r>
+        <w:rPr>
+          <w:rStyle w:val="VerbatimChar"/>
+        </w:rPr>
+        <w:t xml:space="preserve">force_rebuild = FALSE</w:t>
+      </w:r>
+      <w:r>
+        <w:t xml:space="preserve"> </w:t>
+      </w:r>
+      <w:r>
+        <w:t xml:space="preserve">et</w:t>
+      </w:r>
+      <w:r>
+        <w:t xml:space="preserve"> </w:t>
+      </w:r>
+      <w:r>
+        <w:rPr>
+          <w:rStyle w:val="VerbatimChar"/>
+        </w:rPr>
+        <w:t xml:space="preserve">force_rebuild_issues = FALSE</w:t>
+      </w:r>
+      <w:r>
+        <w:t xml:space="preserve"> </w:t>
+      </w:r>
+      <w:r>
+        <w:t xml:space="preserve">: réutilise les sorties existantes.</w:t>
+      </w:r>
+    </w:p>
+    <w:p>
+      <w:pPr>
+        <w:pStyle w:val="FirstParagraph"/>
+      </w:pPr>
+      <w:r>
+        <w:t xml:space="preserve">Usage conseillé :</w:t>
+      </w:r>
+    </w:p>
+    <w:p>
+      <w:pPr>
+        <w:pStyle w:val="Compact"/>
+        <w:numPr>
+          <w:ilvl w:val="0"/>
+          <w:numId w:val="1044"/>
+        </w:numPr>
+      </w:pPr>
+      <w:r>
+        <w:t xml:space="preserve">en itération QA :</w:t>
+      </w:r>
+      <w:r>
+        <w:t xml:space="preserve"> </w:t>
+      </w:r>
+      <w:r>
+        <w:rPr>
+          <w:rStyle w:val="VerbatimChar"/>
+        </w:rPr>
+        <w:t xml:space="preserve">force_rebuild_issues = TRUE</w:t>
+      </w:r>
+      <w:r>
+        <w:t xml:space="preserve">,</w:t>
+      </w:r>
+    </w:p>
+    <w:p>
+      <w:pPr>
+        <w:pStyle w:val="Compact"/>
+        <w:numPr>
+          <w:ilvl w:val="0"/>
+          <w:numId w:val="1044"/>
+        </w:numPr>
+      </w:pPr>
+      <w:r>
+        <w:t xml:space="preserve">avant diffusion :</w:t>
+      </w:r>
+      <w:r>
+        <w:t xml:space="preserve"> </w:t>
+      </w:r>
+      <w:r>
+        <w:rPr>
+          <w:rStyle w:val="VerbatimChar"/>
+        </w:rPr>
+        <w:t xml:space="preserve">force_rebuild = TRUE</w:t>
+      </w:r>
+      <w:r>
+        <w:t xml:space="preserve">.</w:t>
+      </w:r>
+    </w:p>
+    <w:bookmarkEnd w:id="39"/>
+    <w:bookmarkStart w:id="40" w:name="autres-edits-potentiels-utiles"/>
+    <w:p>
+      <w:pPr>
+        <w:pStyle w:val="Heading2"/>
+      </w:pPr>
+      <w:r>
+        <w:t xml:space="preserve">11.2 Autres edits potentiels utiles</w:t>
+      </w:r>
+    </w:p>
+    <w:p>
+      <w:pPr>
+        <w:pStyle w:val="Compact"/>
+        <w:numPr>
+          <w:ilvl w:val="0"/>
+          <w:numId w:val="1045"/>
+        </w:numPr>
+      </w:pPr>
+      <w:r>
+        <w:rPr>
+          <w:rStyle w:val="VerbatimChar"/>
+        </w:rPr>
+        <w:t xml:space="preserve">options(somec.mission_filter = c("MISSION1", "MISSION2"))</w:t>
+      </w:r>
+      <w:r>
+        <w:t xml:space="preserve"> </w:t>
+      </w:r>
+      <w:r>
+        <w:t xml:space="preserve">pour profiler un sous-ensemble.</w:t>
+      </w:r>
+    </w:p>
+    <w:p>
+      <w:pPr>
+        <w:pStyle w:val="Compact"/>
+        <w:numPr>
+          <w:ilvl w:val="0"/>
+          <w:numId w:val="1045"/>
+        </w:numPr>
+      </w:pPr>
+      <w:r>
+        <w:t xml:space="preserve">Ajuster</w:t>
+      </w:r>
+      <w:r>
+        <w:t xml:space="preserve"> </w:t>
+      </w:r>
+      <w:r>
+        <w:rPr>
+          <w:rStyle w:val="VerbatimChar"/>
+        </w:rPr>
+        <w:t xml:space="preserve">cfg$skip_pattern</w:t>
+      </w:r>
+      <w:r>
+        <w:t xml:space="preserve"> </w:t>
+      </w:r>
+      <w:r>
+        <w:t xml:space="preserve">(colonnes commentaire ignorées).</w:t>
+      </w:r>
+    </w:p>
+    <w:p>
+      <w:pPr>
+        <w:pStyle w:val="Compact"/>
+        <w:numPr>
+          <w:ilvl w:val="0"/>
+          <w:numId w:val="1045"/>
+        </w:numPr>
+      </w:pPr>
+      <w:r>
+        <w:t xml:space="preserve">Ajuster</w:t>
+      </w:r>
+      <w:r>
+        <w:t xml:space="preserve"> </w:t>
+      </w:r>
+      <w:r>
+        <w:rPr>
+          <w:rStyle w:val="VerbatimChar"/>
+        </w:rPr>
+        <w:t xml:space="preserve">cfg$top_unknowns_per_col</w:t>
+      </w:r>
+      <w:r>
+        <w:t xml:space="preserve"> </w:t>
+      </w:r>
+      <w:r>
+        <w:t xml:space="preserve">/</w:t>
+      </w:r>
+      <w:r>
+        <w:t xml:space="preserve"> </w:t>
+      </w:r>
+      <w:r>
+        <w:rPr>
+          <w:rStyle w:val="VerbatimChar"/>
+        </w:rPr>
+        <w:t xml:space="preserve">cfg$max_levels_show</w:t>
+      </w:r>
+      <w:r>
+        <w:t xml:space="preserve"> </w:t>
+      </w:r>
+      <w:r>
+        <w:t xml:space="preserve">(lisibilité rapports).</w:t>
+      </w:r>
+    </w:p>
+    <w:p>
+      <w:pPr>
+        <w:pStyle w:val="Compact"/>
+        <w:numPr>
+          <w:ilvl w:val="0"/>
+          <w:numId w:val="1045"/>
+        </w:numPr>
+      </w:pPr>
+      <w:r>
+        <w:t xml:space="preserve">Utiliser</w:t>
+      </w:r>
+      <w:r>
+        <w:t xml:space="preserve"> </w:t>
+      </w:r>
+      <w:r>
+        <w:rPr>
+          <w:rStyle w:val="VerbatimChar"/>
+        </w:rPr>
+        <w:t xml:space="preserve">SOMEC_ACCDB_PATH</w:t>
+      </w:r>
+      <w:r>
+        <w:t xml:space="preserve"> </w:t>
+      </w:r>
+      <w:r>
+        <w:t xml:space="preserve">pour verrouiller la base cible.</w:t>
       </w:r>
     </w:p>
     <w:p>
@@ -3431,8 +4782,8 @@
         </w:pict>
       </w:r>
     </w:p>
-    <w:bookmarkEnd w:id="35"/>
-    <w:bookmarkStart w:id="36" w:name="bonnes-pratiques-qa"/>
+    <w:bookmarkEnd w:id="40"/>
+    <w:bookmarkStart w:id="41" w:name="bonnes-pratiques-qa"/>
     <w:p>
       <w:pPr>
         <w:pStyle w:val="Heading2"/>
@@ -3446,7 +4797,7 @@
         <w:pStyle w:val="Compact"/>
         <w:numPr>
           <w:ilvl w:val="0"/>
-          <w:numId w:val="1039"/>
+          <w:numId w:val="1046"/>
         </w:numPr>
       </w:pPr>
       <w:r>
@@ -3471,7 +4822,7 @@
         <w:pStyle w:val="Compact"/>
         <w:numPr>
           <w:ilvl w:val="0"/>
-          <w:numId w:val="1039"/>
+          <w:numId w:val="1046"/>
         </w:numPr>
       </w:pPr>
       <w:r>
@@ -3483,7 +4834,7 @@
         <w:pStyle w:val="Compact"/>
         <w:numPr>
           <w:ilvl w:val="0"/>
-          <w:numId w:val="1039"/>
+          <w:numId w:val="1046"/>
         </w:numPr>
       </w:pPr>
       <w:r>
@@ -3495,7 +4846,7 @@
         <w:pStyle w:val="Compact"/>
         <w:numPr>
           <w:ilvl w:val="0"/>
-          <w:numId w:val="1039"/>
+          <w:numId w:val="1046"/>
         </w:numPr>
       </w:pPr>
       <w:r>
@@ -3507,7 +4858,7 @@
         <w:pStyle w:val="Compact"/>
         <w:numPr>
           <w:ilvl w:val="0"/>
-          <w:numId w:val="1039"/>
+          <w:numId w:val="1046"/>
         </w:numPr>
       </w:pPr>
       <w:r>
@@ -3533,8 +4884,8 @@
         </w:pict>
       </w:r>
     </w:p>
-    <w:bookmarkEnd w:id="36"/>
-    <w:bookmarkStart w:id="37" w:name="dépannage"/>
+    <w:bookmarkEnd w:id="41"/>
+    <w:bookmarkStart w:id="42" w:name="dépannage"/>
     <w:p>
       <w:pPr>
         <w:pStyle w:val="Heading2"/>
@@ -3543,8 +4894,8 @@
         <w:t xml:space="preserve">13) Dépannage</w:t>
       </w:r>
     </w:p>
-    <w:bookmarkEnd w:id="37"/>
-    <w:bookmarkStart w:id="38" w:name="X54675064ac874bf42f1a05ffa9b5a1dd94a67aa"/>
+    <w:bookmarkEnd w:id="42"/>
+    <w:bookmarkStart w:id="43" w:name="X54675064ac874bf42f1a05ffa9b5a1dd94a67aa"/>
     <w:p>
       <w:pPr>
         <w:pStyle w:val="Heading2"/>
@@ -3599,7 +4950,7 @@
         <w:pStyle w:val="Compact"/>
         <w:numPr>
           <w:ilvl w:val="0"/>
-          <w:numId w:val="1040"/>
+          <w:numId w:val="1047"/>
         </w:numPr>
       </w:pPr>
       <w:r>
@@ -3611,15 +4962,15 @@
         <w:pStyle w:val="Compact"/>
         <w:numPr>
           <w:ilvl w:val="0"/>
-          <w:numId w:val="1040"/>
+          <w:numId w:val="1047"/>
         </w:numPr>
       </w:pPr>
       <w:r>
         <w:t xml:space="preserve">ou utiliser Positron.</w:t>
       </w:r>
     </w:p>
-    <w:bookmarkEnd w:id="38"/>
-    <w:bookmarkStart w:id="39" w:name="fichier-access-introuvable"/>
+    <w:bookmarkEnd w:id="43"/>
+    <w:bookmarkStart w:id="44" w:name="fichier-access-introuvable"/>
     <w:p>
       <w:pPr>
         <w:pStyle w:val="Heading2"/>
@@ -3641,7 +4992,7 @@
         <w:pStyle w:val="Compact"/>
         <w:numPr>
           <w:ilvl w:val="0"/>
-          <w:numId w:val="1041"/>
+          <w:numId w:val="1048"/>
         </w:numPr>
       </w:pPr>
       <w:r>
@@ -3657,8 +5008,52 @@
         <w:t xml:space="preserve">(selon config courante du script).</w:t>
       </w:r>
     </w:p>
-    <w:bookmarkEnd w:id="39"/>
-    <w:bookmarkStart w:id="40" w:name="viewer-ne-souvre-pas"/>
+    <w:p>
+      <w:pPr>
+        <w:pStyle w:val="FirstParagraph"/>
+      </w:pPr>
+      <w:r>
+        <w:t xml:space="preserve">Si nécessaire, forcer la sélection via :</w:t>
+      </w:r>
+    </w:p>
+    <w:p>
+      <w:pPr>
+        <w:pStyle w:val="Compact"/>
+        <w:numPr>
+          <w:ilvl w:val="0"/>
+          <w:numId w:val="1049"/>
+        </w:numPr>
+      </w:pPr>
+      <w:r>
+        <w:rPr>
+          <w:rStyle w:val="VerbatimChar"/>
+        </w:rPr>
+        <w:t xml:space="preserve">SOMEC_ACCDB_PATH</w:t>
+      </w:r>
+      <w:r>
+        <w:t xml:space="preserve">, ou</w:t>
+      </w:r>
+    </w:p>
+    <w:p>
+      <w:pPr>
+        <w:pStyle w:val="Compact"/>
+        <w:numPr>
+          <w:ilvl w:val="0"/>
+          <w:numId w:val="1049"/>
+        </w:numPr>
+      </w:pPr>
+      <w:r>
+        <w:rPr>
+          <w:rStyle w:val="VerbatimChar"/>
+        </w:rPr>
+        <w:t xml:space="preserve">SOMEC_ACCDB_SUFFIX</w:t>
+      </w:r>
+      <w:r>
+        <w:t xml:space="preserve">.</w:t>
+      </w:r>
+    </w:p>
+    <w:bookmarkEnd w:id="44"/>
+    <w:bookmarkStart w:id="45" w:name="viewer-ne-souvre-pas"/>
     <w:p>
       <w:pPr>
         <w:pStyle w:val="Heading2"/>
@@ -3693,8 +5088,8 @@
         <w:t xml:space="preserve">Dans ce cas, continuer via console et inspecter les objets manuellement.</w:t>
       </w:r>
     </w:p>
-    <w:bookmarkEnd w:id="40"/>
-    <w:bookmarkStart w:id="41" w:name="erreurs-rodbc-export-accdb"/>
+    <w:bookmarkEnd w:id="45"/>
+    <w:bookmarkStart w:id="46" w:name="erreurs-rodbc-export-accdb"/>
     <w:p>
       <w:pPr>
         <w:pStyle w:val="Heading2"/>
@@ -3708,7 +5103,7 @@
         <w:pStyle w:val="Compact"/>
         <w:numPr>
           <w:ilvl w:val="0"/>
-          <w:numId w:val="1042"/>
+          <w:numId w:val="1050"/>
         </w:numPr>
       </w:pPr>
       <w:r>
@@ -3720,7 +5115,7 @@
         <w:pStyle w:val="Compact"/>
         <w:numPr>
           <w:ilvl w:val="0"/>
-          <w:numId w:val="1042"/>
+          <w:numId w:val="1050"/>
         </w:numPr>
       </w:pPr>
       <w:r>
@@ -3732,7 +5127,7 @@
         <w:pStyle w:val="Compact"/>
         <w:numPr>
           <w:ilvl w:val="0"/>
-          <w:numId w:val="1042"/>
+          <w:numId w:val="1050"/>
         </w:numPr>
       </w:pPr>
       <w:r>
@@ -3758,8 +5153,8 @@
         </w:pict>
       </w:r>
     </w:p>
-    <w:bookmarkEnd w:id="41"/>
-    <w:bookmarkStart w:id="45" w:name="résumé-rapide-des-commandes-utiles"/>
+    <w:bookmarkEnd w:id="46"/>
+    <w:bookmarkStart w:id="51" w:name="résumé-rapide-des-commandes-utiles"/>
     <w:p>
       <w:pPr>
         <w:pStyle w:val="Heading2"/>
@@ -3768,7 +5163,7 @@
         <w:t xml:space="preserve">14) Résumé rapide des commandes utiles</w:t>
       </w:r>
     </w:p>
-    <w:bookmarkStart w:id="42" w:name="lancer-la-session-qa"/>
+    <w:bookmarkStart w:id="47" w:name="lancer-la-session-qa"/>
     <w:p>
       <w:pPr>
         <w:pStyle w:val="Heading3"/>
@@ -3806,8 +5201,8 @@
         <w:t xml:space="preserve">)</w:t>
       </w:r>
     </w:p>
-    <w:bookmarkEnd w:id="42"/>
-    <w:bookmarkStart w:id="43" w:name="X2229e770f82e0d20124233a44d9c0368df2b9f2"/>
+    <w:bookmarkEnd w:id="47"/>
+    <w:bookmarkStart w:id="48" w:name="X2229e770f82e0d20124233a44d9c0368df2b9f2"/>
     <w:p>
       <w:pPr>
         <w:pStyle w:val="Heading3"/>
@@ -3845,8 +5240,8 @@
         <w:t xml:space="preserve">)</w:t>
       </w:r>
     </w:p>
-    <w:bookmarkEnd w:id="43"/>
-    <w:bookmarkStart w:id="44" w:name="exécuter-le-script-de-fixes-généré"/>
+    <w:bookmarkEnd w:id="48"/>
+    <w:bookmarkStart w:id="49" w:name="exécuter-le-script-de-fixes-généré"/>
     <w:p>
       <w:pPr>
         <w:pStyle w:val="Heading3"/>
@@ -3890,6 +5285,45 @@
       </w:pPr>
       <w:r>
         <w:t xml:space="preserve">(adapter le nom selon le fichier réellement créé)</w:t>
+      </w:r>
+    </w:p>
+    <w:bookmarkEnd w:id="49"/>
+    <w:bookmarkStart w:id="50" w:name="générer-la-synthèse-erreurs-mission"/>
+    <w:p>
+      <w:pPr>
+        <w:pStyle w:val="Heading3"/>
+      </w:pPr>
+      <w:r>
+        <w:t xml:space="preserve">Générer la synthèse erreurs mission</w:t>
+      </w:r>
+    </w:p>
+    <w:p>
+      <w:pPr>
+        <w:pStyle w:val="SourceCode"/>
+      </w:pPr>
+      <w:r>
+        <w:rPr>
+          <w:rStyle w:val="FunctionTok"/>
+        </w:rPr>
+        <w:t xml:space="preserve">source</w:t>
+      </w:r>
+      <w:r>
+        <w:rPr>
+          <w:rStyle w:val="NormalTok"/>
+        </w:rPr>
+        <w:t xml:space="preserve">(</w:t>
+      </w:r>
+      <w:r>
+        <w:rPr>
+          <w:rStyle w:val="StringTok"/>
+        </w:rPr>
+        <w:t xml:space="preserve">"mission_error_inventory.R"</w:t>
+      </w:r>
+      <w:r>
+        <w:rPr>
+          <w:rStyle w:val="NormalTok"/>
+        </w:rPr>
+        <w:t xml:space="preserve">)</w:t>
       </w:r>
     </w:p>
     <w:p>
@@ -3899,9 +5333,9 @@
         </w:pict>
       </w:r>
     </w:p>
-    <w:bookmarkEnd w:id="44"/>
-    <w:bookmarkEnd w:id="45"/>
-    <w:bookmarkStart w:id="46" w:name="scripts-en-interaction-vue-densemble"/>
+    <w:bookmarkEnd w:id="50"/>
+    <w:bookmarkEnd w:id="51"/>
+    <w:bookmarkStart w:id="52" w:name="scripts-en-interaction-vue-densemble"/>
     <w:p>
       <w:pPr>
         <w:pStyle w:val="Heading2"/>
@@ -3923,7 +5357,7 @@
         <w:pStyle w:val="Compact"/>
         <w:numPr>
           <w:ilvl w:val="0"/>
-          <w:numId w:val="1043"/>
+          <w:numId w:val="1051"/>
         </w:numPr>
       </w:pPr>
       <w:r>
@@ -3956,7 +5390,7 @@
         <w:pStyle w:val="Compact"/>
         <w:numPr>
           <w:ilvl w:val="0"/>
-          <w:numId w:val="1043"/>
+          <w:numId w:val="1051"/>
         </w:numPr>
       </w:pPr>
       <w:r>
@@ -4023,7 +5457,7 @@
         <w:pStyle w:val="Compact"/>
         <w:numPr>
           <w:ilvl w:val="0"/>
-          <w:numId w:val="1043"/>
+          <w:numId w:val="1051"/>
         </w:numPr>
       </w:pPr>
       <w:r>
@@ -4080,7 +5514,64 @@
         <w:pStyle w:val="Compact"/>
         <w:numPr>
           <w:ilvl w:val="0"/>
-          <w:numId w:val="1043"/>
+          <w:numId w:val="1051"/>
+        </w:numPr>
+      </w:pPr>
+      <w:r>
+        <w:rPr>
+          <w:rStyle w:val="VerbatimChar"/>
+        </w:rPr>
+        <w:t xml:space="preserve">mission_error_inventory.R</w:t>
+      </w:r>
+      <w:r>
+        <w:t xml:space="preserve"> </w:t>
+      </w:r>
+      <w:r>
+        <w:t xml:space="preserve">⟶ consolide</w:t>
+      </w:r>
+      <w:r>
+        <w:t xml:space="preserve"> </w:t>
+      </w:r>
+      <w:r>
+        <w:rPr>
+          <w:rStyle w:val="VerbatimChar"/>
+        </w:rPr>
+        <w:t xml:space="preserve">mission_issues</w:t>
+      </w:r>
+      <w:r>
+        <w:t xml:space="preserve"> </w:t>
+      </w:r>
+      <w:r>
+        <w:t xml:space="preserve">+ règles CV (</w:t>
+      </w:r>
+      <w:r>
+        <w:rPr>
+          <w:rStyle w:val="VerbatimChar"/>
+        </w:rPr>
+        <w:t xml:space="preserve">run_cross_validation</w:t>
+      </w:r>
+      <w:r>
+        <w:t xml:space="preserve">) et exporte</w:t>
+      </w:r>
+      <w:r>
+        <w:t xml:space="preserve"> </w:t>
+      </w:r>
+      <w:r>
+        <w:rPr>
+          <w:rStyle w:val="VerbatimChar"/>
+        </w:rPr>
+        <w:t xml:space="preserve">MissionReports/mission_error_summary_&lt;ACCDB_TAG&gt;.xlsx</w:t>
+      </w:r>
+      <w:r>
+        <w:t xml:space="preserve">.</w:t>
+      </w:r>
+    </w:p>
+    <w:p>
+      <w:pPr>
+        <w:pStyle w:val="Compact"/>
+        <w:numPr>
+          <w:ilvl w:val="0"/>
+          <w:numId w:val="1051"/>
         </w:numPr>
       </w:pPr>
       <w:r>
@@ -4128,7 +5619,7 @@
         <w:pStyle w:val="Compact"/>
         <w:numPr>
           <w:ilvl w:val="0"/>
-          <w:numId w:val="1043"/>
+          <w:numId w:val="1051"/>
         </w:numPr>
       </w:pPr>
       <w:r>
@@ -4162,15 +5653,15 @@
         <w:br/>
       </w:r>
       <w:r>
-        <w:t xml:space="preserve">⟶ gèrent l’écriture des correctifs et la validation croisée R1–R9.</w:t>
-      </w:r>
-    </w:p>
-    <w:p>
-      <w:pPr>
-        <w:pStyle w:val="Compact"/>
-        <w:numPr>
-          <w:ilvl w:val="0"/>
-          <w:numId w:val="1043"/>
+        <w:t xml:space="preserve">⟶ gèrent l’écriture des correctifs et la validation croisée R1–R11.</w:t>
+      </w:r>
+    </w:p>
+    <w:p>
+      <w:pPr>
+        <w:pStyle w:val="Compact"/>
+        <w:numPr>
+          <w:ilvl w:val="0"/>
+          <w:numId w:val="1051"/>
         </w:numPr>
       </w:pPr>
       <w:r>
@@ -4204,8 +5695,8 @@
         <w:t xml:space="preserve">.</w:t>
       </w:r>
     </w:p>
-    <w:bookmarkEnd w:id="46"/>
-    <w:bookmarkStart w:id="47" w:name="références-internes"/>
+    <w:bookmarkEnd w:id="52"/>
+    <w:bookmarkStart w:id="53" w:name="références-internes"/>
     <w:p>
       <w:pPr>
         <w:pStyle w:val="Heading2"/>
@@ -4219,7 +5710,7 @@
         <w:pStyle w:val="Compact"/>
         <w:numPr>
           <w:ilvl w:val="0"/>
-          <w:numId w:val="1044"/>
+          <w:numId w:val="1052"/>
         </w:numPr>
       </w:pPr>
       <w:r>
@@ -4234,7 +5725,7 @@
         <w:pStyle w:val="Compact"/>
         <w:numPr>
           <w:ilvl w:val="0"/>
-          <w:numId w:val="1044"/>
+          <w:numId w:val="1052"/>
         </w:numPr>
       </w:pPr>
       <w:r>
@@ -4249,7 +5740,7 @@
         <w:pStyle w:val="Compact"/>
         <w:numPr>
           <w:ilvl w:val="0"/>
-          <w:numId w:val="1044"/>
+          <w:numId w:val="1052"/>
         </w:numPr>
       </w:pPr>
       <w:r>
@@ -4264,7 +5755,7 @@
         <w:pStyle w:val="Compact"/>
         <w:numPr>
           <w:ilvl w:val="0"/>
-          <w:numId w:val="1044"/>
+          <w:numId w:val="1052"/>
         </w:numPr>
       </w:pPr>
       <w:r>
@@ -4279,7 +5770,7 @@
         <w:pStyle w:val="Compact"/>
         <w:numPr>
           <w:ilvl w:val="0"/>
-          <w:numId w:val="1044"/>
+          <w:numId w:val="1052"/>
         </w:numPr>
       </w:pPr>
       <w:r>
@@ -4294,7 +5785,7 @@
         <w:pStyle w:val="Compact"/>
         <w:numPr>
           <w:ilvl w:val="0"/>
-          <w:numId w:val="1044"/>
+          <w:numId w:val="1052"/>
         </w:numPr>
       </w:pPr>
       <w:r>
@@ -4309,7 +5800,22 @@
         <w:pStyle w:val="Compact"/>
         <w:numPr>
           <w:ilvl w:val="0"/>
-          <w:numId w:val="1044"/>
+          <w:numId w:val="1052"/>
+        </w:numPr>
+      </w:pPr>
+      <w:r>
+        <w:rPr>
+          <w:rStyle w:val="VerbatimChar"/>
+        </w:rPr>
+        <w:t xml:space="preserve">mission_error_inventory.R</w:t>
+      </w:r>
+    </w:p>
+    <w:p>
+      <w:pPr>
+        <w:pStyle w:val="Compact"/>
+        <w:numPr>
+          <w:ilvl w:val="0"/>
+          <w:numId w:val="1052"/>
         </w:numPr>
       </w:pPr>
       <w:r>
@@ -4324,7 +5830,7 @@
         <w:pStyle w:val="Compact"/>
         <w:numPr>
           <w:ilvl w:val="0"/>
-          <w:numId w:val="1044"/>
+          <w:numId w:val="1052"/>
         </w:numPr>
       </w:pPr>
       <w:r>
@@ -4339,7 +5845,7 @@
         <w:pStyle w:val="Compact"/>
         <w:numPr>
           <w:ilvl w:val="0"/>
-          <w:numId w:val="1044"/>
+          <w:numId w:val="1052"/>
         </w:numPr>
       </w:pPr>
       <w:r>
@@ -4347,6 +5853,21 @@
           <w:rStyle w:val="VerbatimChar"/>
         </w:rPr>
         <w:t xml:space="preserve">MissionReports/mission_issues.rds</w:t>
+      </w:r>
+    </w:p>
+    <w:p>
+      <w:pPr>
+        <w:pStyle w:val="Compact"/>
+        <w:numPr>
+          <w:ilvl w:val="0"/>
+          <w:numId w:val="1052"/>
+        </w:numPr>
+      </w:pPr>
+      <w:r>
+        <w:rPr>
+          <w:rStyle w:val="VerbatimChar"/>
+        </w:rPr>
+        <w:t xml:space="preserve">MissionReports/mission_error_summary_&lt;ACCDB_TAG&gt;.xlsx</w:t>
       </w:r>
     </w:p>
     <w:p>
@@ -4364,8 +5885,8 @@
         <w:t xml:space="preserve">Document restauré et consolidé pour l’usage complet du flux QA/QC interactif SOMEC.</w:t>
       </w:r>
     </w:p>
-    <w:bookmarkEnd w:id="47"/>
-    <w:bookmarkEnd w:id="48"/>
+    <w:bookmarkEnd w:id="53"/>
+    <w:bookmarkEnd w:id="54"/>
     <w:sectPr>
       <w:footnotePr>
         <w:numRestart w:val="eachSect"/>
@@ -4707,6 +6228,9 @@
     <w:abstractNumId w:val="991"/>
   </w:num>
   <w:num w:numId="1014">
+    <w:abstractNumId w:val="991"/>
+  </w:num>
+  <w:num w:numId="1015">
     <w:abstractNumId w:val="99411"/>
     <w:lvlOverride w:ilvl="0">
       <w:startOverride w:val="1"/>
@@ -4736,13 +6260,13 @@
       <w:startOverride w:val="1"/>
     </w:lvlOverride>
   </w:num>
-  <w:num w:numId="1015">
-    <w:abstractNumId w:val="991"/>
-  </w:num>
   <w:num w:numId="1016">
     <w:abstractNumId w:val="991"/>
   </w:num>
   <w:num w:numId="1017">
+    <w:abstractNumId w:val="991"/>
+  </w:num>
+  <w:num w:numId="1018">
     <w:abstractNumId w:val="99411"/>
     <w:lvlOverride w:ilvl="0">
       <w:startOverride w:val="1"/>
@@ -4772,14 +6296,38 @@
       <w:startOverride w:val="1"/>
     </w:lvlOverride>
   </w:num>
-  <w:num w:numId="1018">
-    <w:abstractNumId w:val="991"/>
-  </w:num>
   <w:num w:numId="1019">
     <w:abstractNumId w:val="991"/>
   </w:num>
   <w:num w:numId="1020">
-    <w:abstractNumId w:val="991"/>
+    <w:abstractNumId w:val="99411"/>
+    <w:lvlOverride w:ilvl="0">
+      <w:startOverride w:val="1"/>
+    </w:lvlOverride>
+    <w:lvlOverride w:ilvl="1">
+      <w:startOverride w:val="1"/>
+    </w:lvlOverride>
+    <w:lvlOverride w:ilvl="2">
+      <w:startOverride w:val="1"/>
+    </w:lvlOverride>
+    <w:lvlOverride w:ilvl="3">
+      <w:startOverride w:val="1"/>
+    </w:lvlOverride>
+    <w:lvlOverride w:ilvl="4">
+      <w:startOverride w:val="1"/>
+    </w:lvlOverride>
+    <w:lvlOverride w:ilvl="5">
+      <w:startOverride w:val="1"/>
+    </w:lvlOverride>
+    <w:lvlOverride w:ilvl="6">
+      <w:startOverride w:val="1"/>
+    </w:lvlOverride>
+    <w:lvlOverride w:ilvl="7">
+      <w:startOverride w:val="1"/>
+    </w:lvlOverride>
+    <w:lvlOverride w:ilvl="8">
+      <w:startOverride w:val="1"/>
+    </w:lvlOverride>
   </w:num>
   <w:num w:numId="1021">
     <w:abstractNumId w:val="991"/>
@@ -4812,6 +6360,18 @@
     <w:abstractNumId w:val="991"/>
   </w:num>
   <w:num w:numId="1031">
+    <w:abstractNumId w:val="991"/>
+  </w:num>
+  <w:num w:numId="1032">
+    <w:abstractNumId w:val="991"/>
+  </w:num>
+  <w:num w:numId="1033">
+    <w:abstractNumId w:val="991"/>
+  </w:num>
+  <w:num w:numId="1034">
+    <w:abstractNumId w:val="991"/>
+  </w:num>
+  <w:num w:numId="1035">
     <w:abstractNumId w:val="99411"/>
     <w:lvlOverride w:ilvl="0">
       <w:startOverride w:val="1"/>
@@ -4841,19 +6401,19 @@
       <w:startOverride w:val="1"/>
     </w:lvlOverride>
   </w:num>
-  <w:num w:numId="1032">
+  <w:num w:numId="1036">
     <w:abstractNumId w:val="991"/>
   </w:num>
-  <w:num w:numId="1033">
+  <w:num w:numId="1037">
     <w:abstractNumId w:val="991"/>
   </w:num>
-  <w:num w:numId="1034">
+  <w:num w:numId="1038">
     <w:abstractNumId w:val="991"/>
   </w:num>
-  <w:num w:numId="1035">
+  <w:num w:numId="1039">
     <w:abstractNumId w:val="991"/>
   </w:num>
-  <w:num w:numId="1036">
+  <w:num w:numId="1040">
     <w:abstractNumId w:val="99411"/>
     <w:lvlOverride w:ilvl="0">
       <w:startOverride w:val="1"/>
@@ -4883,18 +6443,6 @@
       <w:startOverride w:val="1"/>
     </w:lvlOverride>
   </w:num>
-  <w:num w:numId="1037">
-    <w:abstractNumId w:val="991"/>
-  </w:num>
-  <w:num w:numId="1038">
-    <w:abstractNumId w:val="991"/>
-  </w:num>
-  <w:num w:numId="1039">
-    <w:abstractNumId w:val="991"/>
-  </w:num>
-  <w:num w:numId="1040">
-    <w:abstractNumId w:val="991"/>
-  </w:num>
   <w:num w:numId="1041">
     <w:abstractNumId w:val="991"/>
   </w:num>
@@ -4902,6 +6450,30 @@
     <w:abstractNumId w:val="991"/>
   </w:num>
   <w:num w:numId="1043">
+    <w:abstractNumId w:val="991"/>
+  </w:num>
+  <w:num w:numId="1044">
+    <w:abstractNumId w:val="991"/>
+  </w:num>
+  <w:num w:numId="1045">
+    <w:abstractNumId w:val="991"/>
+  </w:num>
+  <w:num w:numId="1046">
+    <w:abstractNumId w:val="991"/>
+  </w:num>
+  <w:num w:numId="1047">
+    <w:abstractNumId w:val="991"/>
+  </w:num>
+  <w:num w:numId="1048">
+    <w:abstractNumId w:val="991"/>
+  </w:num>
+  <w:num w:numId="1049">
+    <w:abstractNumId w:val="991"/>
+  </w:num>
+  <w:num w:numId="1050">
+    <w:abstractNumId w:val="991"/>
+  </w:num>
+  <w:num w:numId="1051">
     <w:abstractNumId w:val="99411"/>
     <w:lvlOverride w:ilvl="0">
       <w:startOverride w:val="1"/>
@@ -4931,7 +6503,7 @@
       <w:startOverride w:val="1"/>
     </w:lvlOverride>
   </w:num>
-  <w:num w:numId="1044">
+  <w:num w:numId="1052">
     <w:abstractNumId w:val="991"/>
   </w:num>
 </w:numbering>

</xml_diff>